<commit_message>
Cleanup and more port
</commit_message>
<xml_diff>
--- a/docs/TaktOS_Benchmark_Report.docx
+++ b/docs/TaktOS_Benchmark_Report.docx
@@ -45,7 +45,7 @@
           <w:sz w:val="20"/>
           <w:szCs w:val="20"/>
         </w:rPr>
-        <w:t xml:space="preserve">ARM Cortex-M4F / M33  ·  KVB + Thread-Metric  ·  4-way (TaktOS / FreeRTOS / ThreadX / Zephyr)  ·  Rev 3.3  ·  May 2026</w:t>
+        <w:t xml:space="preserve">ARM Cortex-M0 / M4F / M33  ·  KVB + Thread-Metric  ·  4-way (TaktOS / FreeRTOS / ThreadX / Zephyr)  ·  Rev 3.5  ·  May 2026</w:t>
       </w:r>
     </w:p>
     <w:tbl>
@@ -200,7 +200,7 @@
               <w:spacing w:after="80"/>
             </w:pPr>
             <w:r>
-              <w:t xml:space="preserve">nRF52-DK / PCA10040 (Cortex-M4F @ 64 MHz)</w:t>
+              <w:t xml:space="preserve">nRF52-DK (M4F @ 64 MHz)  ·  STM32F0308-DISCO (M0 @ 48 MHz)</w:t>
             </w:r>
           </w:p>
         </w:tc>
@@ -428,7 +428,7 @@
               <w:spacing w:after="80"/>
             </w:pPr>
             <w:r>
-              <w:t xml:space="preserve">All four kernels: 7/7 PASS on every run, every board</w:t>
+              <w:t xml:space="preserve">Every kernel passes every test on every board (4-way M33/M4; 3-way M0)</w:t>
             </w:r>
           </w:p>
         </w:tc>
@@ -1112,6 +1112,210 @@
           </w:p>
         </w:tc>
       </w:tr>
+      <w:tr>
+        <w:tc>
+          <w:tcPr>
+            <w:tcW w:type="dxa" w:w="800"/>
+            <w:tcBorders>
+              <w:top w:val="single" w:color="BFBFBF" w:sz="4"/>
+              <w:left w:val="single" w:color="BFBFBF" w:sz="4"/>
+              <w:bottom w:val="single" w:color="BFBFBF" w:sz="4"/>
+              <w:right w:val="single" w:color="BFBFBF" w:sz="4"/>
+            </w:tcBorders>
+            <w:tcMar>
+              <w:top w:type="dxa" w:w="70"/>
+              <w:left w:type="dxa" w:w="120"/>
+              <w:bottom w:type="dxa" w:w="70"/>
+              <w:right w:type="dxa" w:w="120"/>
+            </w:tcMar>
+          </w:tcPr>
+          <w:p>
+            <w:pPr>
+              <w:spacing w:after="80"/>
+            </w:pPr>
+            <w:r>
+              <w:t xml:space="preserve">3.4</w:t>
+            </w:r>
+          </w:p>
+        </w:tc>
+        <w:tc>
+          <w:tcPr>
+            <w:tcW w:type="dxa" w:w="1300"/>
+            <w:tcBorders>
+              <w:top w:val="single" w:color="BFBFBF" w:sz="4"/>
+              <w:left w:val="single" w:color="BFBFBF" w:sz="4"/>
+              <w:bottom w:val="single" w:color="BFBFBF" w:sz="4"/>
+              <w:right w:val="single" w:color="BFBFBF" w:sz="4"/>
+            </w:tcBorders>
+            <w:tcMar>
+              <w:top w:type="dxa" w:w="70"/>
+              <w:left w:type="dxa" w:w="120"/>
+              <w:bottom w:type="dxa" w:w="70"/>
+              <w:right w:type="dxa" w:w="120"/>
+            </w:tcMar>
+          </w:tcPr>
+          <w:p>
+            <w:pPr>
+              <w:spacing w:after="80"/>
+            </w:pPr>
+            <w:r>
+              <w:t xml:space="preserve">May 2026</w:t>
+            </w:r>
+          </w:p>
+        </w:tc>
+        <w:tc>
+          <w:tcPr>
+            <w:tcW w:type="dxa" w:w="1800"/>
+            <w:tcBorders>
+              <w:top w:val="single" w:color="BFBFBF" w:sz="4"/>
+              <w:left w:val="single" w:color="BFBFBF" w:sz="4"/>
+              <w:bottom w:val="single" w:color="BFBFBF" w:sz="4"/>
+              <w:right w:val="single" w:color="BFBFBF" w:sz="4"/>
+            </w:tcBorders>
+            <w:tcMar>
+              <w:top w:type="dxa" w:w="70"/>
+              <w:left w:type="dxa" w:w="120"/>
+              <w:bottom w:type="dxa" w:w="70"/>
+              <w:right w:type="dxa" w:w="120"/>
+            </w:tcMar>
+          </w:tcPr>
+          <w:p>
+            <w:pPr>
+              <w:spacing w:after="80"/>
+            </w:pPr>
+            <w:r>
+              <w:t xml:space="preserve">N. H. Hoang</w:t>
+            </w:r>
+          </w:p>
+        </w:tc>
+        <w:tc>
+          <w:tcPr>
+            <w:tcW w:type="dxa" w:w="5460"/>
+            <w:tcBorders>
+              <w:top w:val="single" w:color="BFBFBF" w:sz="4"/>
+              <w:left w:val="single" w:color="BFBFBF" w:sz="4"/>
+              <w:bottom w:val="single" w:color="BFBFBF" w:sz="4"/>
+              <w:right w:val="single" w:color="BFBFBF" w:sz="4"/>
+            </w:tcBorders>
+            <w:tcMar>
+              <w:top w:type="dxa" w:w="70"/>
+              <w:left w:type="dxa" w:w="120"/>
+              <w:bottom w:type="dxa" w:w="70"/>
+              <w:right w:type="dxa" w:w="120"/>
+            </w:tcMar>
+          </w:tcPr>
+          <w:p>
+            <w:pPr>
+              <w:spacing w:after="80"/>
+            </w:pPr>
+            <w:r>
+              <w:t xml:space="preserve">Initial STM32F0308 KVB integration (§6) based on the 5-run April 29 aggregate — TaktOS / FreeRTOS V11.3 / ThreadX 6.x, GCC 12.2.x. Three-way only on this target. Superseded by Rev 3.5 with a refreshed 4-run May 5 aggregate.</w:t>
+            </w:r>
+          </w:p>
+        </w:tc>
+      </w:tr>
+      <w:tr>
+        <w:tc>
+          <w:tcPr>
+            <w:tcW w:type="dxa" w:w="800"/>
+            <w:tcBorders>
+              <w:top w:val="single" w:color="BFBFBF" w:sz="4"/>
+              <w:left w:val="single" w:color="BFBFBF" w:sz="4"/>
+              <w:bottom w:val="single" w:color="BFBFBF" w:sz="4"/>
+              <w:right w:val="single" w:color="BFBFBF" w:sz="4"/>
+            </w:tcBorders>
+            <w:tcMar>
+              <w:top w:type="dxa" w:w="70"/>
+              <w:left w:type="dxa" w:w="120"/>
+              <w:bottom w:type="dxa" w:w="70"/>
+              <w:right w:type="dxa" w:w="120"/>
+            </w:tcMar>
+          </w:tcPr>
+          <w:p>
+            <w:pPr>
+              <w:spacing w:after="80"/>
+            </w:pPr>
+            <w:r>
+              <w:t xml:space="preserve">3.5</w:t>
+            </w:r>
+          </w:p>
+        </w:tc>
+        <w:tc>
+          <w:tcPr>
+            <w:tcW w:type="dxa" w:w="1300"/>
+            <w:tcBorders>
+              <w:top w:val="single" w:color="BFBFBF" w:sz="4"/>
+              <w:left w:val="single" w:color="BFBFBF" w:sz="4"/>
+              <w:bottom w:val="single" w:color="BFBFBF" w:sz="4"/>
+              <w:right w:val="single" w:color="BFBFBF" w:sz="4"/>
+            </w:tcBorders>
+            <w:tcMar>
+              <w:top w:type="dxa" w:w="70"/>
+              <w:left w:type="dxa" w:w="120"/>
+              <w:bottom w:type="dxa" w:w="70"/>
+              <w:right w:type="dxa" w:w="120"/>
+            </w:tcMar>
+          </w:tcPr>
+          <w:p>
+            <w:pPr>
+              <w:spacing w:after="80"/>
+            </w:pPr>
+            <w:r>
+              <w:t xml:space="preserve">May 2026</w:t>
+            </w:r>
+          </w:p>
+        </w:tc>
+        <w:tc>
+          <w:tcPr>
+            <w:tcW w:type="dxa" w:w="1800"/>
+            <w:tcBorders>
+              <w:top w:val="single" w:color="BFBFBF" w:sz="4"/>
+              <w:left w:val="single" w:color="BFBFBF" w:sz="4"/>
+              <w:bottom w:val="single" w:color="BFBFBF" w:sz="4"/>
+              <w:right w:val="single" w:color="BFBFBF" w:sz="4"/>
+            </w:tcBorders>
+            <w:tcMar>
+              <w:top w:type="dxa" w:w="70"/>
+              <w:left w:type="dxa" w:w="120"/>
+              <w:bottom w:type="dxa" w:w="70"/>
+              <w:right w:type="dxa" w:w="120"/>
+            </w:tcMar>
+          </w:tcPr>
+          <w:p>
+            <w:pPr>
+              <w:spacing w:after="80"/>
+            </w:pPr>
+            <w:r>
+              <w:t xml:space="preserve">N. H. Hoang</w:t>
+            </w:r>
+          </w:p>
+        </w:tc>
+        <w:tc>
+          <w:tcPr>
+            <w:tcW w:type="dxa" w:w="5460"/>
+            <w:tcBorders>
+              <w:top w:val="single" w:color="BFBFBF" w:sz="4"/>
+              <w:left w:val="single" w:color="BFBFBF" w:sz="4"/>
+              <w:bottom w:val="single" w:color="BFBFBF" w:sz="4"/>
+              <w:right w:val="single" w:color="BFBFBF" w:sz="4"/>
+            </w:tcBorders>
+            <w:tcMar>
+              <w:top w:type="dxa" w:w="70"/>
+              <w:left w:type="dxa" w:w="120"/>
+              <w:bottom w:type="dxa" w:w="70"/>
+              <w:right w:type="dxa" w:w="120"/>
+            </w:tcMar>
+          </w:tcPr>
+          <w:p>
+            <w:pPr>
+              <w:spacing w:after="80"/>
+            </w:pPr>
+            <w:r>
+              <w:t xml:space="preserve">Refreshes §6 STM32F0308 with the 4-run May 5 capture. TaktOS plain-mutex / PCP-mutex split now matches the M33 / M4F structure — plain SYNC_MUTEX_FAST_001 reports 216,834 p/s (vs 176,040 IPCP-unified in Rev 3.4), and a SYNC_MUTEX_PCP_FAST_001 row at 108,334 p/s replaces the previous n/a. Other-test numbers shift by 0.01 % – 1.4 %; binary sizes unchanged. nRF54L15 (§4), nRF52832 (§5), and Thread-Metric Appendix A unchanged from Rev 3.3.</w:t>
+            </w:r>
+          </w:p>
+        </w:tc>
+      </w:tr>
     </w:tbl>
     <w:p>
       <w:pPr>
@@ -1143,7 +1347,7 @@
         <w:spacing w:after="80"/>
       </w:pPr>
       <w:r>
-        <w:t xml:space="preserve">This revision presents directly-measured benchmark results for TaktOS, FreeRTOS V11.3, Eclipse ThreadX V6.4.2, and Zephyr 4.3.99 (NCS v3.3.0) on two ARM Cortex-M targets. Two complementary benchmark suites are reported: KVB (validation-gated, primary headline) and Thread-Metric (industry-standard cross-RTOS throughput, Appendix A). Both are now run with the same toolchain pinning — GCC 12.2.x — so Zephyr is compared on equal terms.</w:t>
+        <w:t xml:space="preserve">This revision presents directly-measured benchmark results for TaktOS, FreeRTOS V11.3, Eclipse ThreadX V6.4.2, and Zephyr 4.3.99 (NCS v3.3.0) on three ARM Cortex-M targets — nRF54L15-DK (M33 @ 128 MHz), nRF52-DK (M4F @ 64 MHz), and STM32F0308-DISCO (M0 @ 48 MHz). Two complementary benchmark suites are reported: KVB (validation-gated, primary headline) and Thread-Metric (industry-standard cross-RTOS throughput, Appendix A). Both are now run with the same toolchain pinning — GCC 12.2.x — so Zephyr is compared on equal terms.</w:t>
       </w:r>
     </w:p>
     <w:p>
@@ -1151,7 +1355,7 @@
         <w:spacing w:after="80"/>
       </w:pPr>
       <w:r>
-        <w:t xml:space="preserve">The change from Rev 3.2 is the Thread-Metric refresh: the old Rev 3.1 GCC 15.2.1 / three-way data is retired and replaced with a fresh four-way capture at GCC 12.2.x. KVB headline tables in §1, §4, §5 are unchanged from Rev 3.2. TaktOS leads every test on every board on both benchmark suites.</w:t>
+        <w:t xml:space="preserve">The change from Rev 3.3 is the addition of STM32F0308-DISCO (Cortex-M0 @ 48 MHz) as a third KVB target — see §6. ARMv6-M has no DWT, no CLZ, and no LDREX/STREX, so the M0 result is the most architecturally constrained data point in the suite. STM32F0308 is currently 3-way (TaktOS / FreeRTOS / ThreadX); a Zephyr port at the parity bar used for M33 and M4 is not yet available for this target. KVB headline tables for nRF54L15 (§1.1, §4) and nRF52832 (§1.2, §5) are unchanged from Rev 3.2. Thread-Metric Appendix A is unchanged from Rev 3.3. TaktOS leads every test on every board on both benchmark suites.</w:t>
       </w:r>
     </w:p>
     <w:p>
@@ -4627,7 +4831,7 @@
               <w:t xml:space="preserve">Reading the headline</w:t>
             </w:r>
             <w:r>
-              <w:t xml:space="preserve">  TaktOS leads every throughput test against every other kernel on both boards. Widest gap is SYNC_MUTEX_FAST_001 vs FreeRTOS on M33 (4.91×). Narrowest is SYNC_MUTEX_PCP_FAST_001 vs Zephyr on M4 (1.04×) — TaktOS's Priority Ceiling Protocol path is being measured against the other kernels' Priority Inheritance paths; the protocols differ even though both boost holder priority. See §6 for the protocol distinction. All four kernels pass every behavioural test (mutex ownership, sleep duration); two — TaktOS and Zephyr — additionally meet the strict at-least-N-ticks rule on TIME_SLEEP_001 by design.</w:t>
+              <w:t xml:space="preserve">  TaktOS leads every throughput test against every other kernel on both boards. Widest gap is SYNC_MUTEX_FAST_001 vs FreeRTOS on M33 (4.91×). Narrowest is SYNC_MUTEX_PCP_FAST_001 vs Zephyr on M4 (1.04×) — TaktOS's Priority Ceiling Protocol path is being measured against the other kernels' Priority Inheritance paths; the protocols differ even though both boost holder priority. See §7 for the protocol distinction. All four kernels pass every behavioural test (mutex ownership, sleep duration); two — TaktOS and Zephyr — additionally meet the strict at-least-N-ticks rule on TIME_SLEEP_001 by design.</w:t>
             </w:r>
           </w:p>
         </w:tc>
@@ -5090,7 +5294,7 @@
               <w:spacing w:after="80"/>
             </w:pPr>
             <w:r>
-              <w:t xml:space="preserve">Uncontended priority-boost mutex lock/unlock pair. PCP (TaktOS) vs PI (FreeRTOS / ThreadX / Zephyr) — see §6.2.</w:t>
+              <w:t xml:space="preserve">Uncontended priority-boost mutex lock/unlock pair. PCP (TaktOS) vs PI (FreeRTOS / ThreadX / Zephyr) — see §7.2.</w:t>
             </w:r>
           </w:p>
         </w:tc>
@@ -10046,7 +10250,7 @@
         <w:spacing w:after="80"/>
       </w:pPr>
       <w:r>
-        <w:t xml:space="preserve">TaktOS leads every throughput test on M33. SYNC_MUTEX_FAST_001 is the widest gap (4.91× vs FreeRTOS, 2.88× vs ThreadX, 3.12× vs Zephyr). SYNC_MUTEX_PCP_FAST_001 is the narrowest in absolute terms, but the test compares TaktOS PCP against the other three kernels' PI paths — see §6.2.</w:t>
+        <w:t xml:space="preserve">TaktOS leads every throughput test on M33. SYNC_MUTEX_FAST_001 is the widest gap (4.91× vs FreeRTOS, 2.88× vs ThreadX, 3.12× vs Zephyr). SYNC_MUTEX_PCP_FAST_001 is the narrowest in absolute terms, but the test compares TaktOS PCP against the other three kernels' PI paths — see §7.2.</w:t>
       </w:r>
     </w:p>
     <w:p>
@@ -12902,7 +13106,7 @@
         <w:spacing w:after="80"/>
       </w:pPr>
       <w:r>
-        <w:t xml:space="preserve">TaktOS leads every throughput test on M4 as well. The narrowest margin in the entire report is SYNC_MUTEX_PCP_FAST_001 vs Zephyr on M4 at +4% (1.04×) — TaktOS's PCP path against Zephyr's PI path. Both protocols boost holder priority; the bookkeeping shapes differ. See §6.2.</w:t>
+        <w:t xml:space="preserve">TaktOS leads every throughput test on M4 as well. The narrowest margin in the entire report is SYNC_MUTEX_PCP_FAST_001 vs Zephyr on M4 at +4% (1.04×) — TaktOS's PCP path against Zephyr's PI path. Both protocols boost holder priority; the bookkeeping shapes differ. See §7.2.</w:t>
       </w:r>
     </w:p>
     <w:p>
@@ -13357,7 +13561,7 @@
           <w:sz w:val="32"/>
           <w:szCs w:val="32"/>
         </w:rPr>
-        <w:t xml:space="preserve">6.  Behavioural Tests</w:t>
+        <w:t xml:space="preserve">6.  STM32F0308 Results — Cortex-M0 @ 48 MHz</w:t>
       </w:r>
     </w:p>
     <w:p>
@@ -13374,7 +13578,2937 @@
           <w:sz w:val="26"/>
           <w:szCs w:val="26"/>
         </w:rPr>
-        <w:t xml:space="preserve">6.1  Mutex ownership rejection</w:t>
+        <w:t xml:space="preserve">6.1  Throughput</w:t>
+      </w:r>
+    </w:p>
+    <w:tbl>
+      <w:tblPr>
+        <w:tblW w:type="dxa" w:w="9360"/>
+        <w:tblBorders>
+          <w:top w:val="single" w:color="auto" w:sz="4"/>
+          <w:left w:val="single" w:color="auto" w:sz="4"/>
+          <w:bottom w:val="single" w:color="auto" w:sz="4"/>
+          <w:right w:val="single" w:color="auto" w:sz="4"/>
+          <w:insideH w:val="single" w:color="auto" w:sz="4"/>
+          <w:insideV w:val="single" w:color="auto" w:sz="4"/>
+        </w:tblBorders>
+      </w:tblPr>
+      <w:tblGrid>
+        <w:gridCol w:w="2300"/>
+        <w:gridCol w:w="1100"/>
+        <w:gridCol w:w="1000"/>
+        <w:gridCol w:w="1000"/>
+        <w:gridCol w:w="1000"/>
+        <w:gridCol w:w="990"/>
+        <w:gridCol w:w="990"/>
+        <w:gridCol w:w="980"/>
+      </w:tblGrid>
+      <w:tr>
+        <w:trPr>
+          <w:tblHeader/>
+        </w:trPr>
+        <w:tc>
+          <w:tcPr>
+            <w:tcW w:type="dxa" w:w="2300"/>
+            <w:tcBorders>
+              <w:top w:val="single" w:color="BFBFBF" w:sz="4"/>
+              <w:left w:val="single" w:color="BFBFBF" w:sz="4"/>
+              <w:bottom w:val="single" w:color="BFBFBF" w:sz="4"/>
+              <w:right w:val="single" w:color="BFBFBF" w:sz="4"/>
+            </w:tcBorders>
+            <w:shd w:fill="D5E8F0" w:val="clear"/>
+            <w:tcMar>
+              <w:top w:type="dxa" w:w="80"/>
+              <w:left w:type="dxa" w:w="120"/>
+              <w:bottom w:type="dxa" w:w="80"/>
+              <w:right w:type="dxa" w:w="120"/>
+            </w:tcMar>
+          </w:tcPr>
+          <w:p>
+            <w:pPr>
+              <w:spacing w:after="80"/>
+            </w:pPr>
+            <w:r>
+              <w:rPr>
+                <w:b/>
+                <w:bCs/>
+              </w:rPr>
+              <w:t xml:space="preserve">KVB Test</w:t>
+            </w:r>
+          </w:p>
+        </w:tc>
+        <w:tc>
+          <w:tcPr>
+            <w:tcW w:type="dxa" w:w="1100"/>
+            <w:tcBorders>
+              <w:top w:val="single" w:color="BFBFBF" w:sz="4"/>
+              <w:left w:val="single" w:color="BFBFBF" w:sz="4"/>
+              <w:bottom w:val="single" w:color="BFBFBF" w:sz="4"/>
+              <w:right w:val="single" w:color="BFBFBF" w:sz="4"/>
+            </w:tcBorders>
+            <w:shd w:fill="D5E8F0" w:val="clear"/>
+            <w:tcMar>
+              <w:top w:type="dxa" w:w="80"/>
+              <w:left w:type="dxa" w:w="120"/>
+              <w:bottom w:type="dxa" w:w="80"/>
+              <w:right w:type="dxa" w:w="120"/>
+            </w:tcMar>
+          </w:tcPr>
+          <w:p>
+            <w:pPr>
+              <w:spacing w:after="80"/>
+            </w:pPr>
+            <w:r>
+              <w:rPr>
+                <w:b/>
+                <w:bCs/>
+              </w:rPr>
+              <w:t xml:space="preserve">TaktOS</w:t>
+            </w:r>
+          </w:p>
+        </w:tc>
+        <w:tc>
+          <w:tcPr>
+            <w:tcW w:type="dxa" w:w="1000"/>
+            <w:tcBorders>
+              <w:top w:val="single" w:color="BFBFBF" w:sz="4"/>
+              <w:left w:val="single" w:color="BFBFBF" w:sz="4"/>
+              <w:bottom w:val="single" w:color="BFBFBF" w:sz="4"/>
+              <w:right w:val="single" w:color="BFBFBF" w:sz="4"/>
+            </w:tcBorders>
+            <w:shd w:fill="D5E8F0" w:val="clear"/>
+            <w:tcMar>
+              <w:top w:type="dxa" w:w="80"/>
+              <w:left w:type="dxa" w:w="120"/>
+              <w:bottom w:type="dxa" w:w="80"/>
+              <w:right w:type="dxa" w:w="120"/>
+            </w:tcMar>
+          </w:tcPr>
+          <w:p>
+            <w:pPr>
+              <w:spacing w:after="80"/>
+            </w:pPr>
+            <w:r>
+              <w:rPr>
+                <w:b/>
+                <w:bCs/>
+              </w:rPr>
+              <w:t xml:space="preserve">FreeRTOS</w:t>
+            </w:r>
+          </w:p>
+        </w:tc>
+        <w:tc>
+          <w:tcPr>
+            <w:tcW w:type="dxa" w:w="1000"/>
+            <w:tcBorders>
+              <w:top w:val="single" w:color="BFBFBF" w:sz="4"/>
+              <w:left w:val="single" w:color="BFBFBF" w:sz="4"/>
+              <w:bottom w:val="single" w:color="BFBFBF" w:sz="4"/>
+              <w:right w:val="single" w:color="BFBFBF" w:sz="4"/>
+            </w:tcBorders>
+            <w:shd w:fill="D5E8F0" w:val="clear"/>
+            <w:tcMar>
+              <w:top w:type="dxa" w:w="80"/>
+              <w:left w:type="dxa" w:w="120"/>
+              <w:bottom w:type="dxa" w:w="80"/>
+              <w:right w:type="dxa" w:w="120"/>
+            </w:tcMar>
+          </w:tcPr>
+          <w:p>
+            <w:pPr>
+              <w:spacing w:after="80"/>
+            </w:pPr>
+            <w:r>
+              <w:rPr>
+                <w:b/>
+                <w:bCs/>
+              </w:rPr>
+              <w:t xml:space="preserve">ThreadX</w:t>
+            </w:r>
+          </w:p>
+        </w:tc>
+        <w:tc>
+          <w:tcPr>
+            <w:tcW w:type="dxa" w:w="1000"/>
+            <w:tcBorders>
+              <w:top w:val="single" w:color="BFBFBF" w:sz="4"/>
+              <w:left w:val="single" w:color="BFBFBF" w:sz="4"/>
+              <w:bottom w:val="single" w:color="BFBFBF" w:sz="4"/>
+              <w:right w:val="single" w:color="BFBFBF" w:sz="4"/>
+            </w:tcBorders>
+            <w:shd w:fill="D5E8F0" w:val="clear"/>
+            <w:tcMar>
+              <w:top w:type="dxa" w:w="80"/>
+              <w:left w:type="dxa" w:w="120"/>
+              <w:bottom w:type="dxa" w:w="80"/>
+              <w:right w:type="dxa" w:w="120"/>
+            </w:tcMar>
+          </w:tcPr>
+          <w:p>
+            <w:pPr>
+              <w:spacing w:after="80"/>
+            </w:pPr>
+            <w:r>
+              <w:rPr>
+                <w:b/>
+                <w:bCs/>
+              </w:rPr>
+              <w:t xml:space="preserve">Zephyr</w:t>
+            </w:r>
+          </w:p>
+        </w:tc>
+        <w:tc>
+          <w:tcPr>
+            <w:tcW w:type="dxa" w:w="990"/>
+            <w:tcBorders>
+              <w:top w:val="single" w:color="BFBFBF" w:sz="4"/>
+              <w:left w:val="single" w:color="BFBFBF" w:sz="4"/>
+              <w:bottom w:val="single" w:color="BFBFBF" w:sz="4"/>
+              <w:right w:val="single" w:color="BFBFBF" w:sz="4"/>
+            </w:tcBorders>
+            <w:shd w:fill="D5E8F0" w:val="clear"/>
+            <w:tcMar>
+              <w:top w:type="dxa" w:w="80"/>
+              <w:left w:type="dxa" w:w="120"/>
+              <w:bottom w:type="dxa" w:w="80"/>
+              <w:right w:type="dxa" w:w="120"/>
+            </w:tcMar>
+          </w:tcPr>
+          <w:p>
+            <w:pPr>
+              <w:spacing w:after="80"/>
+            </w:pPr>
+            <w:r>
+              <w:rPr>
+                <w:b/>
+                <w:bCs/>
+              </w:rPr>
+              <w:t xml:space="preserve">T/FR</w:t>
+            </w:r>
+          </w:p>
+        </w:tc>
+        <w:tc>
+          <w:tcPr>
+            <w:tcW w:type="dxa" w:w="990"/>
+            <w:tcBorders>
+              <w:top w:val="single" w:color="BFBFBF" w:sz="4"/>
+              <w:left w:val="single" w:color="BFBFBF" w:sz="4"/>
+              <w:bottom w:val="single" w:color="BFBFBF" w:sz="4"/>
+              <w:right w:val="single" w:color="BFBFBF" w:sz="4"/>
+            </w:tcBorders>
+            <w:shd w:fill="D5E8F0" w:val="clear"/>
+            <w:tcMar>
+              <w:top w:type="dxa" w:w="80"/>
+              <w:left w:type="dxa" w:w="120"/>
+              <w:bottom w:type="dxa" w:w="80"/>
+              <w:right w:type="dxa" w:w="120"/>
+            </w:tcMar>
+          </w:tcPr>
+          <w:p>
+            <w:pPr>
+              <w:spacing w:after="80"/>
+            </w:pPr>
+            <w:r>
+              <w:rPr>
+                <w:b/>
+                <w:bCs/>
+              </w:rPr>
+              <w:t xml:space="preserve">T/TX</w:t>
+            </w:r>
+          </w:p>
+        </w:tc>
+        <w:tc>
+          <w:tcPr>
+            <w:tcW w:type="dxa" w:w="980"/>
+            <w:tcBorders>
+              <w:top w:val="single" w:color="BFBFBF" w:sz="4"/>
+              <w:left w:val="single" w:color="BFBFBF" w:sz="4"/>
+              <w:bottom w:val="single" w:color="BFBFBF" w:sz="4"/>
+              <w:right w:val="single" w:color="BFBFBF" w:sz="4"/>
+            </w:tcBorders>
+            <w:shd w:fill="D5E8F0" w:val="clear"/>
+            <w:tcMar>
+              <w:top w:type="dxa" w:w="80"/>
+              <w:left w:type="dxa" w:w="120"/>
+              <w:bottom w:type="dxa" w:w="80"/>
+              <w:right w:type="dxa" w:w="120"/>
+            </w:tcMar>
+          </w:tcPr>
+          <w:p>
+            <w:pPr>
+              <w:spacing w:after="80"/>
+            </w:pPr>
+            <w:r>
+              <w:rPr>
+                <w:b/>
+                <w:bCs/>
+              </w:rPr>
+              <w:t xml:space="preserve">T/Z</w:t>
+            </w:r>
+          </w:p>
+        </w:tc>
+      </w:tr>
+      <w:tr>
+        <w:tc>
+          <w:tcPr>
+            <w:tcW w:type="dxa" w:w="2300"/>
+            <w:tcBorders>
+              <w:top w:val="single" w:color="BFBFBF" w:sz="4"/>
+              <w:left w:val="single" w:color="BFBFBF" w:sz="4"/>
+              <w:bottom w:val="single" w:color="BFBFBF" w:sz="4"/>
+              <w:right w:val="single" w:color="BFBFBF" w:sz="4"/>
+            </w:tcBorders>
+            <w:shd w:fill="E2EFDA" w:val="clear"/>
+            <w:tcMar>
+              <w:top w:type="dxa" w:w="70"/>
+              <w:left w:type="dxa" w:w="120"/>
+              <w:bottom w:type="dxa" w:w="70"/>
+              <w:right w:type="dxa" w:w="120"/>
+            </w:tcMar>
+          </w:tcPr>
+          <w:p>
+            <w:pPr>
+              <w:spacing w:after="80"/>
+            </w:pPr>
+            <w:r>
+              <w:t xml:space="preserve">SCHED_COOP_001 (yields/10 s)</w:t>
+            </w:r>
+          </w:p>
+        </w:tc>
+        <w:tc>
+          <w:tcPr>
+            <w:tcW w:type="dxa" w:w="1100"/>
+            <w:tcBorders>
+              <w:top w:val="single" w:color="BFBFBF" w:sz="4"/>
+              <w:left w:val="single" w:color="BFBFBF" w:sz="4"/>
+              <w:bottom w:val="single" w:color="BFBFBF" w:sz="4"/>
+              <w:right w:val="single" w:color="BFBFBF" w:sz="4"/>
+            </w:tcBorders>
+            <w:tcMar>
+              <w:top w:type="dxa" w:w="70"/>
+              <w:left w:type="dxa" w:w="120"/>
+              <w:bottom w:type="dxa" w:w="70"/>
+              <w:right w:type="dxa" w:w="120"/>
+            </w:tcMar>
+          </w:tcPr>
+          <w:p>
+            <w:pPr>
+              <w:spacing w:after="80"/>
+            </w:pPr>
+            <w:r>
+              <w:t xml:space="preserve">2,518,635</w:t>
+            </w:r>
+          </w:p>
+        </w:tc>
+        <w:tc>
+          <w:tcPr>
+            <w:tcW w:type="dxa" w:w="1000"/>
+            <w:tcBorders>
+              <w:top w:val="single" w:color="BFBFBF" w:sz="4"/>
+              <w:left w:val="single" w:color="BFBFBF" w:sz="4"/>
+              <w:bottom w:val="single" w:color="BFBFBF" w:sz="4"/>
+              <w:right w:val="single" w:color="BFBFBF" w:sz="4"/>
+            </w:tcBorders>
+            <w:tcMar>
+              <w:top w:type="dxa" w:w="70"/>
+              <w:left w:type="dxa" w:w="120"/>
+              <w:bottom w:type="dxa" w:w="70"/>
+              <w:right w:type="dxa" w:w="120"/>
+            </w:tcMar>
+          </w:tcPr>
+          <w:p>
+            <w:pPr>
+              <w:spacing w:after="80"/>
+            </w:pPr>
+            <w:r>
+              <w:t xml:space="preserve">1,808,448</w:t>
+            </w:r>
+          </w:p>
+        </w:tc>
+        <w:tc>
+          <w:tcPr>
+            <w:tcW w:type="dxa" w:w="1000"/>
+            <w:tcBorders>
+              <w:top w:val="single" w:color="BFBFBF" w:sz="4"/>
+              <w:left w:val="single" w:color="BFBFBF" w:sz="4"/>
+              <w:bottom w:val="single" w:color="BFBFBF" w:sz="4"/>
+              <w:right w:val="single" w:color="BFBFBF" w:sz="4"/>
+            </w:tcBorders>
+            <w:tcMar>
+              <w:top w:type="dxa" w:w="70"/>
+              <w:left w:type="dxa" w:w="120"/>
+              <w:bottom w:type="dxa" w:w="70"/>
+              <w:right w:type="dxa" w:w="120"/>
+            </w:tcMar>
+          </w:tcPr>
+          <w:p>
+            <w:pPr>
+              <w:spacing w:after="80"/>
+            </w:pPr>
+            <w:r>
+              <w:t xml:space="preserve">1,196,863</w:t>
+            </w:r>
+          </w:p>
+        </w:tc>
+        <w:tc>
+          <w:tcPr>
+            <w:tcW w:type="dxa" w:w="1000"/>
+            <w:tcBorders>
+              <w:top w:val="single" w:color="BFBFBF" w:sz="4"/>
+              <w:left w:val="single" w:color="BFBFBF" w:sz="4"/>
+              <w:bottom w:val="single" w:color="BFBFBF" w:sz="4"/>
+              <w:right w:val="single" w:color="BFBFBF" w:sz="4"/>
+            </w:tcBorders>
+            <w:tcMar>
+              <w:top w:type="dxa" w:w="70"/>
+              <w:left w:type="dxa" w:w="120"/>
+              <w:bottom w:type="dxa" w:w="70"/>
+              <w:right w:type="dxa" w:w="120"/>
+            </w:tcMar>
+          </w:tcPr>
+          <w:p>
+            <w:pPr>
+              <w:spacing w:after="80"/>
+            </w:pPr>
+            <w:r>
+              <w:t xml:space="preserve">n/a</w:t>
+            </w:r>
+          </w:p>
+        </w:tc>
+        <w:tc>
+          <w:tcPr>
+            <w:tcW w:type="dxa" w:w="990"/>
+            <w:tcBorders>
+              <w:top w:val="single" w:color="BFBFBF" w:sz="4"/>
+              <w:left w:val="single" w:color="BFBFBF" w:sz="4"/>
+              <w:bottom w:val="single" w:color="BFBFBF" w:sz="4"/>
+              <w:right w:val="single" w:color="BFBFBF" w:sz="4"/>
+            </w:tcBorders>
+            <w:tcMar>
+              <w:top w:type="dxa" w:w="70"/>
+              <w:left w:type="dxa" w:w="120"/>
+              <w:bottom w:type="dxa" w:w="70"/>
+              <w:right w:type="dxa" w:w="120"/>
+            </w:tcMar>
+          </w:tcPr>
+          <w:p>
+            <w:pPr>
+              <w:spacing w:after="80"/>
+            </w:pPr>
+            <w:r>
+              <w:t xml:space="preserve">1.39×</w:t>
+            </w:r>
+          </w:p>
+        </w:tc>
+        <w:tc>
+          <w:tcPr>
+            <w:tcW w:type="dxa" w:w="990"/>
+            <w:tcBorders>
+              <w:top w:val="single" w:color="BFBFBF" w:sz="4"/>
+              <w:left w:val="single" w:color="BFBFBF" w:sz="4"/>
+              <w:bottom w:val="single" w:color="BFBFBF" w:sz="4"/>
+              <w:right w:val="single" w:color="BFBFBF" w:sz="4"/>
+            </w:tcBorders>
+            <w:tcMar>
+              <w:top w:type="dxa" w:w="70"/>
+              <w:left w:type="dxa" w:w="120"/>
+              <w:bottom w:type="dxa" w:w="70"/>
+              <w:right w:type="dxa" w:w="120"/>
+            </w:tcMar>
+          </w:tcPr>
+          <w:p>
+            <w:pPr>
+              <w:spacing w:after="80"/>
+            </w:pPr>
+            <w:r>
+              <w:t xml:space="preserve">2.10×</w:t>
+            </w:r>
+          </w:p>
+        </w:tc>
+        <w:tc>
+          <w:tcPr>
+            <w:tcW w:type="dxa" w:w="980"/>
+            <w:tcBorders>
+              <w:top w:val="single" w:color="BFBFBF" w:sz="4"/>
+              <w:left w:val="single" w:color="BFBFBF" w:sz="4"/>
+              <w:bottom w:val="single" w:color="BFBFBF" w:sz="4"/>
+              <w:right w:val="single" w:color="BFBFBF" w:sz="4"/>
+            </w:tcBorders>
+            <w:tcMar>
+              <w:top w:type="dxa" w:w="70"/>
+              <w:left w:type="dxa" w:w="120"/>
+              <w:bottom w:type="dxa" w:w="70"/>
+              <w:right w:type="dxa" w:w="120"/>
+            </w:tcMar>
+          </w:tcPr>
+          <w:p>
+            <w:pPr>
+              <w:spacing w:after="80"/>
+            </w:pPr>
+            <w:r>
+              <w:t xml:space="preserve">—</w:t>
+            </w:r>
+          </w:p>
+        </w:tc>
+      </w:tr>
+      <w:tr>
+        <w:tc>
+          <w:tcPr>
+            <w:tcW w:type="dxa" w:w="2300"/>
+            <w:tcBorders>
+              <w:top w:val="single" w:color="BFBFBF" w:sz="4"/>
+              <w:left w:val="single" w:color="BFBFBF" w:sz="4"/>
+              <w:bottom w:val="single" w:color="BFBFBF" w:sz="4"/>
+              <w:right w:val="single" w:color="BFBFBF" w:sz="4"/>
+            </w:tcBorders>
+            <w:shd w:fill="E2EFDA" w:val="clear"/>
+            <w:tcMar>
+              <w:top w:type="dxa" w:w="70"/>
+              <w:left w:type="dxa" w:w="120"/>
+              <w:bottom w:type="dxa" w:w="70"/>
+              <w:right w:type="dxa" w:w="120"/>
+            </w:tcMar>
+          </w:tcPr>
+          <w:p>
+            <w:pPr>
+              <w:spacing w:after="80"/>
+            </w:pPr>
+            <w:r>
+              <w:t xml:space="preserve">SYNC_SEM_FAST_001 (p/s)</w:t>
+            </w:r>
+          </w:p>
+        </w:tc>
+        <w:tc>
+          <w:tcPr>
+            <w:tcW w:type="dxa" w:w="1100"/>
+            <w:tcBorders>
+              <w:top w:val="single" w:color="BFBFBF" w:sz="4"/>
+              <w:left w:val="single" w:color="BFBFBF" w:sz="4"/>
+              <w:bottom w:val="single" w:color="BFBFBF" w:sz="4"/>
+              <w:right w:val="single" w:color="BFBFBF" w:sz="4"/>
+            </w:tcBorders>
+            <w:tcMar>
+              <w:top w:type="dxa" w:w="70"/>
+              <w:left w:type="dxa" w:w="120"/>
+              <w:bottom w:type="dxa" w:w="70"/>
+              <w:right w:type="dxa" w:w="120"/>
+            </w:tcMar>
+          </w:tcPr>
+          <w:p>
+            <w:pPr>
+              <w:spacing w:after="80"/>
+            </w:pPr>
+            <w:r>
+              <w:t xml:space="preserve">247,054</w:t>
+            </w:r>
+          </w:p>
+        </w:tc>
+        <w:tc>
+          <w:tcPr>
+            <w:tcW w:type="dxa" w:w="1000"/>
+            <w:tcBorders>
+              <w:top w:val="single" w:color="BFBFBF" w:sz="4"/>
+              <w:left w:val="single" w:color="BFBFBF" w:sz="4"/>
+              <w:bottom w:val="single" w:color="BFBFBF" w:sz="4"/>
+              <w:right w:val="single" w:color="BFBFBF" w:sz="4"/>
+            </w:tcBorders>
+            <w:tcMar>
+              <w:top w:type="dxa" w:w="70"/>
+              <w:left w:type="dxa" w:w="120"/>
+              <w:bottom w:type="dxa" w:w="70"/>
+              <w:right w:type="dxa" w:w="120"/>
+            </w:tcMar>
+          </w:tcPr>
+          <w:p>
+            <w:pPr>
+              <w:spacing w:after="80"/>
+            </w:pPr>
+            <w:r>
+              <w:t xml:space="preserve">109,762</w:t>
+            </w:r>
+          </w:p>
+        </w:tc>
+        <w:tc>
+          <w:tcPr>
+            <w:tcW w:type="dxa" w:w="1000"/>
+            <w:tcBorders>
+              <w:top w:val="single" w:color="BFBFBF" w:sz="4"/>
+              <w:left w:val="single" w:color="BFBFBF" w:sz="4"/>
+              <w:bottom w:val="single" w:color="BFBFBF" w:sz="4"/>
+              <w:right w:val="single" w:color="BFBFBF" w:sz="4"/>
+            </w:tcBorders>
+            <w:tcMar>
+              <w:top w:type="dxa" w:w="70"/>
+              <w:left w:type="dxa" w:w="120"/>
+              <w:bottom w:type="dxa" w:w="70"/>
+              <w:right w:type="dxa" w:w="120"/>
+            </w:tcMar>
+          </w:tcPr>
+          <w:p>
+            <w:pPr>
+              <w:spacing w:after="80"/>
+            </w:pPr>
+            <w:r>
+              <w:t xml:space="preserve">195,543</w:t>
+            </w:r>
+          </w:p>
+        </w:tc>
+        <w:tc>
+          <w:tcPr>
+            <w:tcW w:type="dxa" w:w="1000"/>
+            <w:tcBorders>
+              <w:top w:val="single" w:color="BFBFBF" w:sz="4"/>
+              <w:left w:val="single" w:color="BFBFBF" w:sz="4"/>
+              <w:bottom w:val="single" w:color="BFBFBF" w:sz="4"/>
+              <w:right w:val="single" w:color="BFBFBF" w:sz="4"/>
+            </w:tcBorders>
+            <w:tcMar>
+              <w:top w:type="dxa" w:w="70"/>
+              <w:left w:type="dxa" w:w="120"/>
+              <w:bottom w:type="dxa" w:w="70"/>
+              <w:right w:type="dxa" w:w="120"/>
+            </w:tcMar>
+          </w:tcPr>
+          <w:p>
+            <w:pPr>
+              <w:spacing w:after="80"/>
+            </w:pPr>
+            <w:r>
+              <w:t xml:space="preserve">n/a</w:t>
+            </w:r>
+          </w:p>
+        </w:tc>
+        <w:tc>
+          <w:tcPr>
+            <w:tcW w:type="dxa" w:w="990"/>
+            <w:tcBorders>
+              <w:top w:val="single" w:color="BFBFBF" w:sz="4"/>
+              <w:left w:val="single" w:color="BFBFBF" w:sz="4"/>
+              <w:bottom w:val="single" w:color="BFBFBF" w:sz="4"/>
+              <w:right w:val="single" w:color="BFBFBF" w:sz="4"/>
+            </w:tcBorders>
+            <w:tcMar>
+              <w:top w:type="dxa" w:w="70"/>
+              <w:left w:type="dxa" w:w="120"/>
+              <w:bottom w:type="dxa" w:w="70"/>
+              <w:right w:type="dxa" w:w="120"/>
+            </w:tcMar>
+          </w:tcPr>
+          <w:p>
+            <w:pPr>
+              <w:spacing w:after="80"/>
+            </w:pPr>
+            <w:r>
+              <w:t xml:space="preserve">2.25×</w:t>
+            </w:r>
+          </w:p>
+        </w:tc>
+        <w:tc>
+          <w:tcPr>
+            <w:tcW w:type="dxa" w:w="990"/>
+            <w:tcBorders>
+              <w:top w:val="single" w:color="BFBFBF" w:sz="4"/>
+              <w:left w:val="single" w:color="BFBFBF" w:sz="4"/>
+              <w:bottom w:val="single" w:color="BFBFBF" w:sz="4"/>
+              <w:right w:val="single" w:color="BFBFBF" w:sz="4"/>
+            </w:tcBorders>
+            <w:tcMar>
+              <w:top w:type="dxa" w:w="70"/>
+              <w:left w:type="dxa" w:w="120"/>
+              <w:bottom w:type="dxa" w:w="70"/>
+              <w:right w:type="dxa" w:w="120"/>
+            </w:tcMar>
+          </w:tcPr>
+          <w:p>
+            <w:pPr>
+              <w:spacing w:after="80"/>
+            </w:pPr>
+            <w:r>
+              <w:t xml:space="preserve">1.26×</w:t>
+            </w:r>
+          </w:p>
+        </w:tc>
+        <w:tc>
+          <w:tcPr>
+            <w:tcW w:type="dxa" w:w="980"/>
+            <w:tcBorders>
+              <w:top w:val="single" w:color="BFBFBF" w:sz="4"/>
+              <w:left w:val="single" w:color="BFBFBF" w:sz="4"/>
+              <w:bottom w:val="single" w:color="BFBFBF" w:sz="4"/>
+              <w:right w:val="single" w:color="BFBFBF" w:sz="4"/>
+            </w:tcBorders>
+            <w:tcMar>
+              <w:top w:type="dxa" w:w="70"/>
+              <w:left w:type="dxa" w:w="120"/>
+              <w:bottom w:type="dxa" w:w="70"/>
+              <w:right w:type="dxa" w:w="120"/>
+            </w:tcMar>
+          </w:tcPr>
+          <w:p>
+            <w:pPr>
+              <w:spacing w:after="80"/>
+            </w:pPr>
+            <w:r>
+              <w:t xml:space="preserve">—</w:t>
+            </w:r>
+          </w:p>
+        </w:tc>
+      </w:tr>
+      <w:tr>
+        <w:tc>
+          <w:tcPr>
+            <w:tcW w:type="dxa" w:w="2300"/>
+            <w:tcBorders>
+              <w:top w:val="single" w:color="BFBFBF" w:sz="4"/>
+              <w:left w:val="single" w:color="BFBFBF" w:sz="4"/>
+              <w:bottom w:val="single" w:color="BFBFBF" w:sz="4"/>
+              <w:right w:val="single" w:color="BFBFBF" w:sz="4"/>
+            </w:tcBorders>
+            <w:shd w:fill="E2EFDA" w:val="clear"/>
+            <w:tcMar>
+              <w:top w:type="dxa" w:w="70"/>
+              <w:left w:type="dxa" w:w="120"/>
+              <w:bottom w:type="dxa" w:w="70"/>
+              <w:right w:type="dxa" w:w="120"/>
+            </w:tcMar>
+          </w:tcPr>
+          <w:p>
+            <w:pPr>
+              <w:spacing w:after="80"/>
+            </w:pPr>
+            <w:r>
+              <w:t xml:space="preserve">SYNC_MUTEX_FAST_001 (p/s)</w:t>
+            </w:r>
+          </w:p>
+        </w:tc>
+        <w:tc>
+          <w:tcPr>
+            <w:tcW w:type="dxa" w:w="1100"/>
+            <w:tcBorders>
+              <w:top w:val="single" w:color="BFBFBF" w:sz="4"/>
+              <w:left w:val="single" w:color="BFBFBF" w:sz="4"/>
+              <w:bottom w:val="single" w:color="BFBFBF" w:sz="4"/>
+              <w:right w:val="single" w:color="BFBFBF" w:sz="4"/>
+            </w:tcBorders>
+            <w:tcMar>
+              <w:top w:type="dxa" w:w="70"/>
+              <w:left w:type="dxa" w:w="120"/>
+              <w:bottom w:type="dxa" w:w="70"/>
+              <w:right w:type="dxa" w:w="120"/>
+            </w:tcMar>
+          </w:tcPr>
+          <w:p>
+            <w:pPr>
+              <w:spacing w:after="80"/>
+            </w:pPr>
+            <w:r>
+              <w:t xml:space="preserve">216,834</w:t>
+            </w:r>
+          </w:p>
+        </w:tc>
+        <w:tc>
+          <w:tcPr>
+            <w:tcW w:type="dxa" w:w="1000"/>
+            <w:tcBorders>
+              <w:top w:val="single" w:color="BFBFBF" w:sz="4"/>
+              <w:left w:val="single" w:color="BFBFBF" w:sz="4"/>
+              <w:bottom w:val="single" w:color="BFBFBF" w:sz="4"/>
+              <w:right w:val="single" w:color="BFBFBF" w:sz="4"/>
+            </w:tcBorders>
+            <w:tcMar>
+              <w:top w:type="dxa" w:w="70"/>
+              <w:left w:type="dxa" w:w="120"/>
+              <w:bottom w:type="dxa" w:w="70"/>
+              <w:right w:type="dxa" w:w="120"/>
+            </w:tcMar>
+          </w:tcPr>
+          <w:p>
+            <w:pPr>
+              <w:spacing w:after="80"/>
+            </w:pPr>
+            <w:r>
+              <w:t xml:space="preserve">75,125</w:t>
+            </w:r>
+          </w:p>
+        </w:tc>
+        <w:tc>
+          <w:tcPr>
+            <w:tcW w:type="dxa" w:w="1000"/>
+            <w:tcBorders>
+              <w:top w:val="single" w:color="BFBFBF" w:sz="4"/>
+              <w:left w:val="single" w:color="BFBFBF" w:sz="4"/>
+              <w:bottom w:val="single" w:color="BFBFBF" w:sz="4"/>
+              <w:right w:val="single" w:color="BFBFBF" w:sz="4"/>
+            </w:tcBorders>
+            <w:tcMar>
+              <w:top w:type="dxa" w:w="70"/>
+              <w:left w:type="dxa" w:w="120"/>
+              <w:bottom w:type="dxa" w:w="70"/>
+              <w:right w:type="dxa" w:w="120"/>
+            </w:tcMar>
+          </w:tcPr>
+          <w:p>
+            <w:pPr>
+              <w:spacing w:after="80"/>
+            </w:pPr>
+            <w:r>
+              <w:t xml:space="preserve">87,875</w:t>
+            </w:r>
+          </w:p>
+        </w:tc>
+        <w:tc>
+          <w:tcPr>
+            <w:tcW w:type="dxa" w:w="1000"/>
+            <w:tcBorders>
+              <w:top w:val="single" w:color="BFBFBF" w:sz="4"/>
+              <w:left w:val="single" w:color="BFBFBF" w:sz="4"/>
+              <w:bottom w:val="single" w:color="BFBFBF" w:sz="4"/>
+              <w:right w:val="single" w:color="BFBFBF" w:sz="4"/>
+            </w:tcBorders>
+            <w:tcMar>
+              <w:top w:type="dxa" w:w="70"/>
+              <w:left w:type="dxa" w:w="120"/>
+              <w:bottom w:type="dxa" w:w="70"/>
+              <w:right w:type="dxa" w:w="120"/>
+            </w:tcMar>
+          </w:tcPr>
+          <w:p>
+            <w:pPr>
+              <w:spacing w:after="80"/>
+            </w:pPr>
+            <w:r>
+              <w:t xml:space="preserve">n/a</w:t>
+            </w:r>
+          </w:p>
+        </w:tc>
+        <w:tc>
+          <w:tcPr>
+            <w:tcW w:type="dxa" w:w="990"/>
+            <w:tcBorders>
+              <w:top w:val="single" w:color="BFBFBF" w:sz="4"/>
+              <w:left w:val="single" w:color="BFBFBF" w:sz="4"/>
+              <w:bottom w:val="single" w:color="BFBFBF" w:sz="4"/>
+              <w:right w:val="single" w:color="BFBFBF" w:sz="4"/>
+            </w:tcBorders>
+            <w:tcMar>
+              <w:top w:type="dxa" w:w="70"/>
+              <w:left w:type="dxa" w:w="120"/>
+              <w:bottom w:type="dxa" w:w="70"/>
+              <w:right w:type="dxa" w:w="120"/>
+            </w:tcMar>
+          </w:tcPr>
+          <w:p>
+            <w:pPr>
+              <w:spacing w:after="80"/>
+            </w:pPr>
+            <w:r>
+              <w:t xml:space="preserve">2.89×</w:t>
+            </w:r>
+          </w:p>
+        </w:tc>
+        <w:tc>
+          <w:tcPr>
+            <w:tcW w:type="dxa" w:w="990"/>
+            <w:tcBorders>
+              <w:top w:val="single" w:color="BFBFBF" w:sz="4"/>
+              <w:left w:val="single" w:color="BFBFBF" w:sz="4"/>
+              <w:bottom w:val="single" w:color="BFBFBF" w:sz="4"/>
+              <w:right w:val="single" w:color="BFBFBF" w:sz="4"/>
+            </w:tcBorders>
+            <w:tcMar>
+              <w:top w:type="dxa" w:w="70"/>
+              <w:left w:type="dxa" w:w="120"/>
+              <w:bottom w:type="dxa" w:w="70"/>
+              <w:right w:type="dxa" w:w="120"/>
+            </w:tcMar>
+          </w:tcPr>
+          <w:p>
+            <w:pPr>
+              <w:spacing w:after="80"/>
+            </w:pPr>
+            <w:r>
+              <w:t xml:space="preserve">2.47×</w:t>
+            </w:r>
+          </w:p>
+        </w:tc>
+        <w:tc>
+          <w:tcPr>
+            <w:tcW w:type="dxa" w:w="980"/>
+            <w:tcBorders>
+              <w:top w:val="single" w:color="BFBFBF" w:sz="4"/>
+              <w:left w:val="single" w:color="BFBFBF" w:sz="4"/>
+              <w:bottom w:val="single" w:color="BFBFBF" w:sz="4"/>
+              <w:right w:val="single" w:color="BFBFBF" w:sz="4"/>
+            </w:tcBorders>
+            <w:tcMar>
+              <w:top w:type="dxa" w:w="70"/>
+              <w:left w:type="dxa" w:w="120"/>
+              <w:bottom w:type="dxa" w:w="70"/>
+              <w:right w:type="dxa" w:w="120"/>
+            </w:tcMar>
+          </w:tcPr>
+          <w:p>
+            <w:pPr>
+              <w:spacing w:after="80"/>
+            </w:pPr>
+            <w:r>
+              <w:t xml:space="preserve">—</w:t>
+            </w:r>
+          </w:p>
+        </w:tc>
+      </w:tr>
+      <w:tr>
+        <w:tc>
+          <w:tcPr>
+            <w:tcW w:type="dxa" w:w="2300"/>
+            <w:tcBorders>
+              <w:top w:val="single" w:color="BFBFBF" w:sz="4"/>
+              <w:left w:val="single" w:color="BFBFBF" w:sz="4"/>
+              <w:bottom w:val="single" w:color="BFBFBF" w:sz="4"/>
+              <w:right w:val="single" w:color="BFBFBF" w:sz="4"/>
+            </w:tcBorders>
+            <w:shd w:fill="E2EFDA" w:val="clear"/>
+            <w:tcMar>
+              <w:top w:type="dxa" w:w="70"/>
+              <w:left w:type="dxa" w:w="120"/>
+              <w:bottom w:type="dxa" w:w="70"/>
+              <w:right w:type="dxa" w:w="120"/>
+            </w:tcMar>
+          </w:tcPr>
+          <w:p>
+            <w:pPr>
+              <w:spacing w:after="80"/>
+            </w:pPr>
+            <w:r>
+              <w:t xml:space="preserve">SYNC_MUTEX_PCP_FAST_001 (p/s)</w:t>
+            </w:r>
+          </w:p>
+        </w:tc>
+        <w:tc>
+          <w:tcPr>
+            <w:tcW w:type="dxa" w:w="1100"/>
+            <w:tcBorders>
+              <w:top w:val="single" w:color="BFBFBF" w:sz="4"/>
+              <w:left w:val="single" w:color="BFBFBF" w:sz="4"/>
+              <w:bottom w:val="single" w:color="BFBFBF" w:sz="4"/>
+              <w:right w:val="single" w:color="BFBFBF" w:sz="4"/>
+            </w:tcBorders>
+            <w:tcMar>
+              <w:top w:type="dxa" w:w="70"/>
+              <w:left w:type="dxa" w:w="120"/>
+              <w:bottom w:type="dxa" w:w="70"/>
+              <w:right w:type="dxa" w:w="120"/>
+            </w:tcMar>
+          </w:tcPr>
+          <w:p>
+            <w:pPr>
+              <w:spacing w:after="80"/>
+            </w:pPr>
+            <w:r>
+              <w:t xml:space="preserve">108,334</w:t>
+            </w:r>
+          </w:p>
+        </w:tc>
+        <w:tc>
+          <w:tcPr>
+            <w:tcW w:type="dxa" w:w="1000"/>
+            <w:tcBorders>
+              <w:top w:val="single" w:color="BFBFBF" w:sz="4"/>
+              <w:left w:val="single" w:color="BFBFBF" w:sz="4"/>
+              <w:bottom w:val="single" w:color="BFBFBF" w:sz="4"/>
+              <w:right w:val="single" w:color="BFBFBF" w:sz="4"/>
+            </w:tcBorders>
+            <w:tcMar>
+              <w:top w:type="dxa" w:w="70"/>
+              <w:left w:type="dxa" w:w="120"/>
+              <w:bottom w:type="dxa" w:w="70"/>
+              <w:right w:type="dxa" w:w="120"/>
+            </w:tcMar>
+          </w:tcPr>
+          <w:p>
+            <w:pPr>
+              <w:spacing w:after="80"/>
+            </w:pPr>
+            <w:r>
+              <w:t xml:space="preserve">75,595</w:t>
+            </w:r>
+          </w:p>
+        </w:tc>
+        <w:tc>
+          <w:tcPr>
+            <w:tcW w:type="dxa" w:w="1000"/>
+            <w:tcBorders>
+              <w:top w:val="single" w:color="BFBFBF" w:sz="4"/>
+              <w:left w:val="single" w:color="BFBFBF" w:sz="4"/>
+              <w:bottom w:val="single" w:color="BFBFBF" w:sz="4"/>
+              <w:right w:val="single" w:color="BFBFBF" w:sz="4"/>
+            </w:tcBorders>
+            <w:tcMar>
+              <w:top w:type="dxa" w:w="70"/>
+              <w:left w:type="dxa" w:w="120"/>
+              <w:bottom w:type="dxa" w:w="70"/>
+              <w:right w:type="dxa" w:w="120"/>
+            </w:tcMar>
+          </w:tcPr>
+          <w:p>
+            <w:pPr>
+              <w:spacing w:after="80"/>
+            </w:pPr>
+            <w:r>
+              <w:t xml:space="preserve">88,523</w:t>
+            </w:r>
+          </w:p>
+        </w:tc>
+        <w:tc>
+          <w:tcPr>
+            <w:tcW w:type="dxa" w:w="1000"/>
+            <w:tcBorders>
+              <w:top w:val="single" w:color="BFBFBF" w:sz="4"/>
+              <w:left w:val="single" w:color="BFBFBF" w:sz="4"/>
+              <w:bottom w:val="single" w:color="BFBFBF" w:sz="4"/>
+              <w:right w:val="single" w:color="BFBFBF" w:sz="4"/>
+            </w:tcBorders>
+            <w:tcMar>
+              <w:top w:type="dxa" w:w="70"/>
+              <w:left w:type="dxa" w:w="120"/>
+              <w:bottom w:type="dxa" w:w="70"/>
+              <w:right w:type="dxa" w:w="120"/>
+            </w:tcMar>
+          </w:tcPr>
+          <w:p>
+            <w:pPr>
+              <w:spacing w:after="80"/>
+            </w:pPr>
+            <w:r>
+              <w:t xml:space="preserve">n/a</w:t>
+            </w:r>
+          </w:p>
+        </w:tc>
+        <w:tc>
+          <w:tcPr>
+            <w:tcW w:type="dxa" w:w="990"/>
+            <w:tcBorders>
+              <w:top w:val="single" w:color="BFBFBF" w:sz="4"/>
+              <w:left w:val="single" w:color="BFBFBF" w:sz="4"/>
+              <w:bottom w:val="single" w:color="BFBFBF" w:sz="4"/>
+              <w:right w:val="single" w:color="BFBFBF" w:sz="4"/>
+            </w:tcBorders>
+            <w:tcMar>
+              <w:top w:type="dxa" w:w="70"/>
+              <w:left w:type="dxa" w:w="120"/>
+              <w:bottom w:type="dxa" w:w="70"/>
+              <w:right w:type="dxa" w:w="120"/>
+            </w:tcMar>
+          </w:tcPr>
+          <w:p>
+            <w:pPr>
+              <w:spacing w:after="80"/>
+            </w:pPr>
+            <w:r>
+              <w:t xml:space="preserve">1.43×</w:t>
+            </w:r>
+          </w:p>
+        </w:tc>
+        <w:tc>
+          <w:tcPr>
+            <w:tcW w:type="dxa" w:w="990"/>
+            <w:tcBorders>
+              <w:top w:val="single" w:color="BFBFBF" w:sz="4"/>
+              <w:left w:val="single" w:color="BFBFBF" w:sz="4"/>
+              <w:bottom w:val="single" w:color="BFBFBF" w:sz="4"/>
+              <w:right w:val="single" w:color="BFBFBF" w:sz="4"/>
+            </w:tcBorders>
+            <w:tcMar>
+              <w:top w:type="dxa" w:w="70"/>
+              <w:left w:type="dxa" w:w="120"/>
+              <w:bottom w:type="dxa" w:w="70"/>
+              <w:right w:type="dxa" w:w="120"/>
+            </w:tcMar>
+          </w:tcPr>
+          <w:p>
+            <w:pPr>
+              <w:spacing w:after="80"/>
+            </w:pPr>
+            <w:r>
+              <w:t xml:space="preserve">1.22×</w:t>
+            </w:r>
+          </w:p>
+        </w:tc>
+        <w:tc>
+          <w:tcPr>
+            <w:tcW w:type="dxa" w:w="980"/>
+            <w:tcBorders>
+              <w:top w:val="single" w:color="BFBFBF" w:sz="4"/>
+              <w:left w:val="single" w:color="BFBFBF" w:sz="4"/>
+              <w:bottom w:val="single" w:color="BFBFBF" w:sz="4"/>
+              <w:right w:val="single" w:color="BFBFBF" w:sz="4"/>
+            </w:tcBorders>
+            <w:tcMar>
+              <w:top w:type="dxa" w:w="70"/>
+              <w:left w:type="dxa" w:w="120"/>
+              <w:bottom w:type="dxa" w:w="70"/>
+              <w:right w:type="dxa" w:w="120"/>
+            </w:tcMar>
+          </w:tcPr>
+          <w:p>
+            <w:pPr>
+              <w:spacing w:after="80"/>
+            </w:pPr>
+            <w:r>
+              <w:t xml:space="preserve">—</w:t>
+            </w:r>
+          </w:p>
+        </w:tc>
+      </w:tr>
+      <w:tr>
+        <w:tc>
+          <w:tcPr>
+            <w:tcW w:type="dxa" w:w="2300"/>
+            <w:tcBorders>
+              <w:top w:val="single" w:color="BFBFBF" w:sz="4"/>
+              <w:left w:val="single" w:color="BFBFBF" w:sz="4"/>
+              <w:bottom w:val="single" w:color="BFBFBF" w:sz="4"/>
+              <w:right w:val="single" w:color="BFBFBF" w:sz="4"/>
+            </w:tcBorders>
+            <w:shd w:fill="E2EFDA" w:val="clear"/>
+            <w:tcMar>
+              <w:top w:type="dxa" w:w="70"/>
+              <w:left w:type="dxa" w:w="120"/>
+              <w:bottom w:type="dxa" w:w="70"/>
+              <w:right w:type="dxa" w:w="120"/>
+            </w:tcMar>
+          </w:tcPr>
+          <w:p>
+            <w:pPr>
+              <w:spacing w:after="80"/>
+            </w:pPr>
+            <w:r>
+              <w:t xml:space="preserve">IPC_QUEUE_FAST_001 (p/s)</w:t>
+            </w:r>
+          </w:p>
+        </w:tc>
+        <w:tc>
+          <w:tcPr>
+            <w:tcW w:type="dxa" w:w="1100"/>
+            <w:tcBorders>
+              <w:top w:val="single" w:color="BFBFBF" w:sz="4"/>
+              <w:left w:val="single" w:color="BFBFBF" w:sz="4"/>
+              <w:bottom w:val="single" w:color="BFBFBF" w:sz="4"/>
+              <w:right w:val="single" w:color="BFBFBF" w:sz="4"/>
+            </w:tcBorders>
+            <w:tcMar>
+              <w:top w:type="dxa" w:w="70"/>
+              <w:left w:type="dxa" w:w="120"/>
+              <w:bottom w:type="dxa" w:w="70"/>
+              <w:right w:type="dxa" w:w="120"/>
+            </w:tcMar>
+          </w:tcPr>
+          <w:p>
+            <w:pPr>
+              <w:spacing w:after="80"/>
+            </w:pPr>
+            <w:r>
+              <w:t xml:space="preserve">77,975</w:t>
+            </w:r>
+          </w:p>
+        </w:tc>
+        <w:tc>
+          <w:tcPr>
+            <w:tcW w:type="dxa" w:w="1000"/>
+            <w:tcBorders>
+              <w:top w:val="single" w:color="BFBFBF" w:sz="4"/>
+              <w:left w:val="single" w:color="BFBFBF" w:sz="4"/>
+              <w:bottom w:val="single" w:color="BFBFBF" w:sz="4"/>
+              <w:right w:val="single" w:color="BFBFBF" w:sz="4"/>
+            </w:tcBorders>
+            <w:tcMar>
+              <w:top w:type="dxa" w:w="70"/>
+              <w:left w:type="dxa" w:w="120"/>
+              <w:bottom w:type="dxa" w:w="70"/>
+              <w:right w:type="dxa" w:w="120"/>
+            </w:tcMar>
+          </w:tcPr>
+          <w:p>
+            <w:pPr>
+              <w:spacing w:after="80"/>
+            </w:pPr>
+            <w:r>
+              <w:t xml:space="preserve">38,593</w:t>
+            </w:r>
+          </w:p>
+        </w:tc>
+        <w:tc>
+          <w:tcPr>
+            <w:tcW w:type="dxa" w:w="1000"/>
+            <w:tcBorders>
+              <w:top w:val="single" w:color="BFBFBF" w:sz="4"/>
+              <w:left w:val="single" w:color="BFBFBF" w:sz="4"/>
+              <w:bottom w:val="single" w:color="BFBFBF" w:sz="4"/>
+              <w:right w:val="single" w:color="BFBFBF" w:sz="4"/>
+            </w:tcBorders>
+            <w:tcMar>
+              <w:top w:type="dxa" w:w="70"/>
+              <w:left w:type="dxa" w:w="120"/>
+              <w:bottom w:type="dxa" w:w="70"/>
+              <w:right w:type="dxa" w:w="120"/>
+            </w:tcMar>
+          </w:tcPr>
+          <w:p>
+            <w:pPr>
+              <w:spacing w:after="80"/>
+            </w:pPr>
+            <w:r>
+              <w:t xml:space="preserve">60,849</w:t>
+            </w:r>
+          </w:p>
+        </w:tc>
+        <w:tc>
+          <w:tcPr>
+            <w:tcW w:type="dxa" w:w="1000"/>
+            <w:tcBorders>
+              <w:top w:val="single" w:color="BFBFBF" w:sz="4"/>
+              <w:left w:val="single" w:color="BFBFBF" w:sz="4"/>
+              <w:bottom w:val="single" w:color="BFBFBF" w:sz="4"/>
+              <w:right w:val="single" w:color="BFBFBF" w:sz="4"/>
+            </w:tcBorders>
+            <w:tcMar>
+              <w:top w:type="dxa" w:w="70"/>
+              <w:left w:type="dxa" w:w="120"/>
+              <w:bottom w:type="dxa" w:w="70"/>
+              <w:right w:type="dxa" w:w="120"/>
+            </w:tcMar>
+          </w:tcPr>
+          <w:p>
+            <w:pPr>
+              <w:spacing w:after="80"/>
+            </w:pPr>
+            <w:r>
+              <w:t xml:space="preserve">n/a</w:t>
+            </w:r>
+          </w:p>
+        </w:tc>
+        <w:tc>
+          <w:tcPr>
+            <w:tcW w:type="dxa" w:w="990"/>
+            <w:tcBorders>
+              <w:top w:val="single" w:color="BFBFBF" w:sz="4"/>
+              <w:left w:val="single" w:color="BFBFBF" w:sz="4"/>
+              <w:bottom w:val="single" w:color="BFBFBF" w:sz="4"/>
+              <w:right w:val="single" w:color="BFBFBF" w:sz="4"/>
+            </w:tcBorders>
+            <w:tcMar>
+              <w:top w:type="dxa" w:w="70"/>
+              <w:left w:type="dxa" w:w="120"/>
+              <w:bottom w:type="dxa" w:w="70"/>
+              <w:right w:type="dxa" w:w="120"/>
+            </w:tcMar>
+          </w:tcPr>
+          <w:p>
+            <w:pPr>
+              <w:spacing w:after="80"/>
+            </w:pPr>
+            <w:r>
+              <w:t xml:space="preserve">2.02×</w:t>
+            </w:r>
+          </w:p>
+        </w:tc>
+        <w:tc>
+          <w:tcPr>
+            <w:tcW w:type="dxa" w:w="990"/>
+            <w:tcBorders>
+              <w:top w:val="single" w:color="BFBFBF" w:sz="4"/>
+              <w:left w:val="single" w:color="BFBFBF" w:sz="4"/>
+              <w:bottom w:val="single" w:color="BFBFBF" w:sz="4"/>
+              <w:right w:val="single" w:color="BFBFBF" w:sz="4"/>
+            </w:tcBorders>
+            <w:tcMar>
+              <w:top w:type="dxa" w:w="70"/>
+              <w:left w:type="dxa" w:w="120"/>
+              <w:bottom w:type="dxa" w:w="70"/>
+              <w:right w:type="dxa" w:w="120"/>
+            </w:tcMar>
+          </w:tcPr>
+          <w:p>
+            <w:pPr>
+              <w:spacing w:after="80"/>
+            </w:pPr>
+            <w:r>
+              <w:t xml:space="preserve">1.28×</w:t>
+            </w:r>
+          </w:p>
+        </w:tc>
+        <w:tc>
+          <w:tcPr>
+            <w:tcW w:type="dxa" w:w="980"/>
+            <w:tcBorders>
+              <w:top w:val="single" w:color="BFBFBF" w:sz="4"/>
+              <w:left w:val="single" w:color="BFBFBF" w:sz="4"/>
+              <w:bottom w:val="single" w:color="BFBFBF" w:sz="4"/>
+              <w:right w:val="single" w:color="BFBFBF" w:sz="4"/>
+            </w:tcBorders>
+            <w:tcMar>
+              <w:top w:type="dxa" w:w="70"/>
+              <w:left w:type="dxa" w:w="120"/>
+              <w:bottom w:type="dxa" w:w="70"/>
+              <w:right w:type="dxa" w:w="120"/>
+            </w:tcMar>
+          </w:tcPr>
+          <w:p>
+            <w:pPr>
+              <w:spacing w:after="80"/>
+            </w:pPr>
+            <w:r>
+              <w:t xml:space="preserve">—</w:t>
+            </w:r>
+          </w:p>
+        </w:tc>
+      </w:tr>
+      <w:tr>
+        <w:tc>
+          <w:tcPr>
+            <w:tcW w:type="dxa" w:w="2300"/>
+            <w:tcBorders>
+              <w:top w:val="single" w:color="BFBFBF" w:sz="4"/>
+              <w:left w:val="single" w:color="BFBFBF" w:sz="4"/>
+              <w:bottom w:val="single" w:color="BFBFBF" w:sz="4"/>
+              <w:right w:val="single" w:color="BFBFBF" w:sz="4"/>
+            </w:tcBorders>
+            <w:shd w:fill="E2EFDA" w:val="clear"/>
+            <w:tcMar>
+              <w:top w:type="dxa" w:w="70"/>
+              <w:left w:type="dxa" w:w="120"/>
+              <w:bottom w:type="dxa" w:w="70"/>
+              <w:right w:type="dxa" w:w="120"/>
+            </w:tcMar>
+          </w:tcPr>
+          <w:p>
+            <w:pPr>
+              <w:spacing w:after="80"/>
+            </w:pPr>
+            <w:r>
+              <w:t xml:space="preserve">SYNC_MUTEX_OWNERSHIP_001</w:t>
+            </w:r>
+          </w:p>
+        </w:tc>
+        <w:tc>
+          <w:tcPr>
+            <w:tcW w:type="dxa" w:w="1100"/>
+            <w:tcBorders>
+              <w:top w:val="single" w:color="BFBFBF" w:sz="4"/>
+              <w:left w:val="single" w:color="BFBFBF" w:sz="4"/>
+              <w:bottom w:val="single" w:color="BFBFBF" w:sz="4"/>
+              <w:right w:val="single" w:color="BFBFBF" w:sz="4"/>
+            </w:tcBorders>
+            <w:tcMar>
+              <w:top w:type="dxa" w:w="70"/>
+              <w:left w:type="dxa" w:w="120"/>
+              <w:bottom w:type="dxa" w:w="70"/>
+              <w:right w:type="dxa" w:w="120"/>
+            </w:tcMar>
+          </w:tcPr>
+          <w:p>
+            <w:pPr>
+              <w:spacing w:after="80"/>
+            </w:pPr>
+            <w:r>
+              <w:t xml:space="preserve">PASS</w:t>
+            </w:r>
+          </w:p>
+        </w:tc>
+        <w:tc>
+          <w:tcPr>
+            <w:tcW w:type="dxa" w:w="1000"/>
+            <w:tcBorders>
+              <w:top w:val="single" w:color="BFBFBF" w:sz="4"/>
+              <w:left w:val="single" w:color="BFBFBF" w:sz="4"/>
+              <w:bottom w:val="single" w:color="BFBFBF" w:sz="4"/>
+              <w:right w:val="single" w:color="BFBFBF" w:sz="4"/>
+            </w:tcBorders>
+            <w:tcMar>
+              <w:top w:type="dxa" w:w="70"/>
+              <w:left w:type="dxa" w:w="120"/>
+              <w:bottom w:type="dxa" w:w="70"/>
+              <w:right w:type="dxa" w:w="120"/>
+            </w:tcMar>
+          </w:tcPr>
+          <w:p>
+            <w:pPr>
+              <w:spacing w:after="80"/>
+            </w:pPr>
+            <w:r>
+              <w:t xml:space="preserve">PASS</w:t>
+            </w:r>
+          </w:p>
+        </w:tc>
+        <w:tc>
+          <w:tcPr>
+            <w:tcW w:type="dxa" w:w="1000"/>
+            <w:tcBorders>
+              <w:top w:val="single" w:color="BFBFBF" w:sz="4"/>
+              <w:left w:val="single" w:color="BFBFBF" w:sz="4"/>
+              <w:bottom w:val="single" w:color="BFBFBF" w:sz="4"/>
+              <w:right w:val="single" w:color="BFBFBF" w:sz="4"/>
+            </w:tcBorders>
+            <w:tcMar>
+              <w:top w:type="dxa" w:w="70"/>
+              <w:left w:type="dxa" w:w="120"/>
+              <w:bottom w:type="dxa" w:w="70"/>
+              <w:right w:type="dxa" w:w="120"/>
+            </w:tcMar>
+          </w:tcPr>
+          <w:p>
+            <w:pPr>
+              <w:spacing w:after="80"/>
+            </w:pPr>
+            <w:r>
+              <w:t xml:space="preserve">PASS</w:t>
+            </w:r>
+          </w:p>
+        </w:tc>
+        <w:tc>
+          <w:tcPr>
+            <w:tcW w:type="dxa" w:w="1000"/>
+            <w:tcBorders>
+              <w:top w:val="single" w:color="BFBFBF" w:sz="4"/>
+              <w:left w:val="single" w:color="BFBFBF" w:sz="4"/>
+              <w:bottom w:val="single" w:color="BFBFBF" w:sz="4"/>
+              <w:right w:val="single" w:color="BFBFBF" w:sz="4"/>
+            </w:tcBorders>
+            <w:tcMar>
+              <w:top w:type="dxa" w:w="70"/>
+              <w:left w:type="dxa" w:w="120"/>
+              <w:bottom w:type="dxa" w:w="70"/>
+              <w:right w:type="dxa" w:w="120"/>
+            </w:tcMar>
+          </w:tcPr>
+          <w:p>
+            <w:pPr>
+              <w:spacing w:after="80"/>
+            </w:pPr>
+            <w:r>
+              <w:t xml:space="preserve">PASS</w:t>
+            </w:r>
+          </w:p>
+        </w:tc>
+        <w:tc>
+          <w:tcPr>
+            <w:tcW w:type="dxa" w:w="990"/>
+            <w:tcBorders>
+              <w:top w:val="single" w:color="BFBFBF" w:sz="4"/>
+              <w:left w:val="single" w:color="BFBFBF" w:sz="4"/>
+              <w:bottom w:val="single" w:color="BFBFBF" w:sz="4"/>
+              <w:right w:val="single" w:color="BFBFBF" w:sz="4"/>
+            </w:tcBorders>
+            <w:tcMar>
+              <w:top w:type="dxa" w:w="70"/>
+              <w:left w:type="dxa" w:w="120"/>
+              <w:bottom w:type="dxa" w:w="70"/>
+              <w:right w:type="dxa" w:w="120"/>
+            </w:tcMar>
+          </w:tcPr>
+          <w:p>
+            <w:pPr>
+              <w:spacing w:after="80"/>
+            </w:pPr>
+            <w:r>
+              <w:t xml:space="preserve">parity</w:t>
+            </w:r>
+          </w:p>
+        </w:tc>
+        <w:tc>
+          <w:tcPr>
+            <w:tcW w:type="dxa" w:w="990"/>
+            <w:tcBorders>
+              <w:top w:val="single" w:color="BFBFBF" w:sz="4"/>
+              <w:left w:val="single" w:color="BFBFBF" w:sz="4"/>
+              <w:bottom w:val="single" w:color="BFBFBF" w:sz="4"/>
+              <w:right w:val="single" w:color="BFBFBF" w:sz="4"/>
+            </w:tcBorders>
+            <w:tcMar>
+              <w:top w:type="dxa" w:w="70"/>
+              <w:left w:type="dxa" w:w="120"/>
+              <w:bottom w:type="dxa" w:w="70"/>
+              <w:right w:type="dxa" w:w="120"/>
+            </w:tcMar>
+          </w:tcPr>
+          <w:p>
+            <w:pPr>
+              <w:spacing w:after="80"/>
+            </w:pPr>
+            <w:r>
+              <w:t xml:space="preserve">parity</w:t>
+            </w:r>
+          </w:p>
+        </w:tc>
+        <w:tc>
+          <w:tcPr>
+            <w:tcW w:type="dxa" w:w="980"/>
+            <w:tcBorders>
+              <w:top w:val="single" w:color="BFBFBF" w:sz="4"/>
+              <w:left w:val="single" w:color="BFBFBF" w:sz="4"/>
+              <w:bottom w:val="single" w:color="BFBFBF" w:sz="4"/>
+              <w:right w:val="single" w:color="BFBFBF" w:sz="4"/>
+            </w:tcBorders>
+            <w:tcMar>
+              <w:top w:type="dxa" w:w="70"/>
+              <w:left w:type="dxa" w:w="120"/>
+              <w:bottom w:type="dxa" w:w="70"/>
+              <w:right w:type="dxa" w:w="120"/>
+            </w:tcMar>
+          </w:tcPr>
+          <w:p>
+            <w:pPr>
+              <w:spacing w:after="80"/>
+            </w:pPr>
+            <w:r>
+              <w:t xml:space="preserve">parity</w:t>
+            </w:r>
+          </w:p>
+        </w:tc>
+      </w:tr>
+      <w:tr>
+        <w:tc>
+          <w:tcPr>
+            <w:tcW w:type="dxa" w:w="2300"/>
+            <w:tcBorders>
+              <w:top w:val="single" w:color="BFBFBF" w:sz="4"/>
+              <w:left w:val="single" w:color="BFBFBF" w:sz="4"/>
+              <w:bottom w:val="single" w:color="BFBFBF" w:sz="4"/>
+              <w:right w:val="single" w:color="BFBFBF" w:sz="4"/>
+            </w:tcBorders>
+            <w:shd w:fill="E2EFDA" w:val="clear"/>
+            <w:tcMar>
+              <w:top w:type="dxa" w:w="70"/>
+              <w:left w:type="dxa" w:w="120"/>
+              <w:bottom w:type="dxa" w:w="70"/>
+              <w:right w:type="dxa" w:w="120"/>
+            </w:tcMar>
+          </w:tcPr>
+          <w:p>
+            <w:pPr>
+              <w:spacing w:after="80"/>
+            </w:pPr>
+            <w:r>
+              <w:t xml:space="preserve">TIME_SLEEP_001</w:t>
+            </w:r>
+          </w:p>
+        </w:tc>
+        <w:tc>
+          <w:tcPr>
+            <w:tcW w:type="dxa" w:w="1100"/>
+            <w:tcBorders>
+              <w:top w:val="single" w:color="BFBFBF" w:sz="4"/>
+              <w:left w:val="single" w:color="BFBFBF" w:sz="4"/>
+              <w:bottom w:val="single" w:color="BFBFBF" w:sz="4"/>
+              <w:right w:val="single" w:color="BFBFBF" w:sz="4"/>
+            </w:tcBorders>
+            <w:tcMar>
+              <w:top w:type="dxa" w:w="70"/>
+              <w:left w:type="dxa" w:w="120"/>
+              <w:bottom w:type="dxa" w:w="70"/>
+              <w:right w:type="dxa" w:w="120"/>
+            </w:tcMar>
+          </w:tcPr>
+          <w:p>
+            <w:pPr>
+              <w:spacing w:after="80"/>
+            </w:pPr>
+            <w:r>
+              <w:t xml:space="preserve">PASS @10476 µs</w:t>
+            </w:r>
+          </w:p>
+        </w:tc>
+        <w:tc>
+          <w:tcPr>
+            <w:tcW w:type="dxa" w:w="1000"/>
+            <w:tcBorders>
+              <w:top w:val="single" w:color="BFBFBF" w:sz="4"/>
+              <w:left w:val="single" w:color="BFBFBF" w:sz="4"/>
+              <w:bottom w:val="single" w:color="BFBFBF" w:sz="4"/>
+              <w:right w:val="single" w:color="BFBFBF" w:sz="4"/>
+            </w:tcBorders>
+            <w:tcMar>
+              <w:top w:type="dxa" w:w="70"/>
+              <w:left w:type="dxa" w:w="120"/>
+              <w:bottom w:type="dxa" w:w="70"/>
+              <w:right w:type="dxa" w:w="120"/>
+            </w:tcMar>
+          </w:tcPr>
+          <w:p>
+            <w:pPr>
+              <w:spacing w:after="80"/>
+            </w:pPr>
+            <w:r>
+              <w:t xml:space="preserve">PASS @10005 µs</w:t>
+            </w:r>
+          </w:p>
+        </w:tc>
+        <w:tc>
+          <w:tcPr>
+            <w:tcW w:type="dxa" w:w="1000"/>
+            <w:tcBorders>
+              <w:top w:val="single" w:color="BFBFBF" w:sz="4"/>
+              <w:left w:val="single" w:color="BFBFBF" w:sz="4"/>
+              <w:bottom w:val="single" w:color="BFBFBF" w:sz="4"/>
+              <w:right w:val="single" w:color="BFBFBF" w:sz="4"/>
+            </w:tcBorders>
+            <w:tcMar>
+              <w:top w:type="dxa" w:w="70"/>
+              <w:left w:type="dxa" w:w="120"/>
+              <w:bottom w:type="dxa" w:w="70"/>
+              <w:right w:type="dxa" w:w="120"/>
+            </w:tcMar>
+          </w:tcPr>
+          <w:p>
+            <w:pPr>
+              <w:spacing w:after="80"/>
+            </w:pPr>
+            <w:r>
+              <w:t xml:space="preserve">PASS @9537 µs</w:t>
+            </w:r>
+          </w:p>
+        </w:tc>
+        <w:tc>
+          <w:tcPr>
+            <w:tcW w:type="dxa" w:w="1000"/>
+            <w:tcBorders>
+              <w:top w:val="single" w:color="BFBFBF" w:sz="4"/>
+              <w:left w:val="single" w:color="BFBFBF" w:sz="4"/>
+              <w:bottom w:val="single" w:color="BFBFBF" w:sz="4"/>
+              <w:right w:val="single" w:color="BFBFBF" w:sz="4"/>
+            </w:tcBorders>
+            <w:tcMar>
+              <w:top w:type="dxa" w:w="70"/>
+              <w:left w:type="dxa" w:w="120"/>
+              <w:bottom w:type="dxa" w:w="70"/>
+              <w:right w:type="dxa" w:w="120"/>
+            </w:tcMar>
+          </w:tcPr>
+          <w:p>
+            <w:pPr>
+              <w:spacing w:after="80"/>
+            </w:pPr>
+            <w:r>
+              <w:t xml:space="preserve">n/a</w:t>
+            </w:r>
+          </w:p>
+        </w:tc>
+        <w:tc>
+          <w:tcPr>
+            <w:tcW w:type="dxa" w:w="990"/>
+            <w:tcBorders>
+              <w:top w:val="single" w:color="BFBFBF" w:sz="4"/>
+              <w:left w:val="single" w:color="BFBFBF" w:sz="4"/>
+              <w:bottom w:val="single" w:color="BFBFBF" w:sz="4"/>
+              <w:right w:val="single" w:color="BFBFBF" w:sz="4"/>
+            </w:tcBorders>
+            <w:tcMar>
+              <w:top w:type="dxa" w:w="70"/>
+              <w:left w:type="dxa" w:w="120"/>
+              <w:bottom w:type="dxa" w:w="70"/>
+              <w:right w:type="dxa" w:w="120"/>
+            </w:tcMar>
+          </w:tcPr>
+          <w:p>
+            <w:pPr>
+              <w:spacing w:after="80"/>
+            </w:pPr>
+            <w:r>
+              <w:t xml:space="preserve">—</w:t>
+            </w:r>
+          </w:p>
+        </w:tc>
+        <w:tc>
+          <w:tcPr>
+            <w:tcW w:type="dxa" w:w="990"/>
+            <w:tcBorders>
+              <w:top w:val="single" w:color="BFBFBF" w:sz="4"/>
+              <w:left w:val="single" w:color="BFBFBF" w:sz="4"/>
+              <w:bottom w:val="single" w:color="BFBFBF" w:sz="4"/>
+              <w:right w:val="single" w:color="BFBFBF" w:sz="4"/>
+            </w:tcBorders>
+            <w:tcMar>
+              <w:top w:type="dxa" w:w="70"/>
+              <w:left w:type="dxa" w:w="120"/>
+              <w:bottom w:type="dxa" w:w="70"/>
+              <w:right w:type="dxa" w:w="120"/>
+            </w:tcMar>
+          </w:tcPr>
+          <w:p>
+            <w:pPr>
+              <w:spacing w:after="80"/>
+            </w:pPr>
+            <w:r>
+              <w:t xml:space="preserve">—</w:t>
+            </w:r>
+          </w:p>
+        </w:tc>
+        <w:tc>
+          <w:tcPr>
+            <w:tcW w:type="dxa" w:w="980"/>
+            <w:tcBorders>
+              <w:top w:val="single" w:color="BFBFBF" w:sz="4"/>
+              <w:left w:val="single" w:color="BFBFBF" w:sz="4"/>
+              <w:bottom w:val="single" w:color="BFBFBF" w:sz="4"/>
+              <w:right w:val="single" w:color="BFBFBF" w:sz="4"/>
+            </w:tcBorders>
+            <w:tcMar>
+              <w:top w:type="dxa" w:w="70"/>
+              <w:left w:type="dxa" w:w="120"/>
+              <w:bottom w:type="dxa" w:w="70"/>
+              <w:right w:type="dxa" w:w="120"/>
+            </w:tcMar>
+          </w:tcPr>
+          <w:p>
+            <w:pPr>
+              <w:spacing w:after="80"/>
+            </w:pPr>
+            <w:r>
+              <w:t xml:space="preserve">—</w:t>
+            </w:r>
+          </w:p>
+        </w:tc>
+      </w:tr>
+    </w:tbl>
+    <w:p>
+      <w:pPr>
+        <w:spacing w:after="80"/>
+      </w:pPr>
+      <w:r>
+        <w:t xml:space="preserve"/>
+      </w:r>
+    </w:p>
+    <w:p>
+      <w:pPr>
+        <w:pStyle w:val="Heading2"/>
+        <w:spacing w:after="100" w:before="220"/>
+      </w:pPr>
+      <w:r>
+        <w:rPr>
+          <w:rFonts w:ascii="Arial" w:cs="Arial" w:eastAsia="Arial" w:hAnsi="Arial"/>
+          <w:b/>
+          <w:bCs/>
+          <w:color w:val="1F3864"/>
+          <w:sz w:val="26"/>
+          <w:szCs w:val="26"/>
+        </w:rPr>
+        <w:t xml:space="preserve">6.2  Speedup ratios</w:t>
+      </w:r>
+    </w:p>
+    <w:tbl>
+      <w:tblPr>
+        <w:tblW w:type="dxa" w:w="9360"/>
+        <w:tblBorders>
+          <w:top w:val="single" w:color="auto" w:sz="4"/>
+          <w:left w:val="single" w:color="auto" w:sz="4"/>
+          <w:bottom w:val="single" w:color="auto" w:sz="4"/>
+          <w:right w:val="single" w:color="auto" w:sz="4"/>
+          <w:insideH w:val="single" w:color="auto" w:sz="4"/>
+          <w:insideV w:val="single" w:color="auto" w:sz="4"/>
+        </w:tblBorders>
+      </w:tblPr>
+      <w:tblGrid>
+        <w:gridCol w:w="3000"/>
+        <w:gridCol w:w="2120"/>
+        <w:gridCol w:w="2120"/>
+        <w:gridCol w:w="2120"/>
+      </w:tblGrid>
+      <w:tr>
+        <w:trPr>
+          <w:tblHeader/>
+        </w:trPr>
+        <w:tc>
+          <w:tcPr>
+            <w:tcW w:type="dxa" w:w="3000"/>
+            <w:tcBorders>
+              <w:top w:val="single" w:color="BFBFBF" w:sz="4"/>
+              <w:left w:val="single" w:color="BFBFBF" w:sz="4"/>
+              <w:bottom w:val="single" w:color="BFBFBF" w:sz="4"/>
+              <w:right w:val="single" w:color="BFBFBF" w:sz="4"/>
+            </w:tcBorders>
+            <w:shd w:fill="D5E8F0" w:val="clear"/>
+            <w:tcMar>
+              <w:top w:type="dxa" w:w="80"/>
+              <w:left w:type="dxa" w:w="120"/>
+              <w:bottom w:type="dxa" w:w="80"/>
+              <w:right w:type="dxa" w:w="120"/>
+            </w:tcMar>
+          </w:tcPr>
+          <w:p>
+            <w:pPr>
+              <w:spacing w:after="80"/>
+            </w:pPr>
+            <w:r>
+              <w:rPr>
+                <w:b/>
+                <w:bCs/>
+              </w:rPr>
+              <w:t xml:space="preserve">Test</w:t>
+            </w:r>
+          </w:p>
+        </w:tc>
+        <w:tc>
+          <w:tcPr>
+            <w:tcW w:type="dxa" w:w="2120"/>
+            <w:tcBorders>
+              <w:top w:val="single" w:color="BFBFBF" w:sz="4"/>
+              <w:left w:val="single" w:color="BFBFBF" w:sz="4"/>
+              <w:bottom w:val="single" w:color="BFBFBF" w:sz="4"/>
+              <w:right w:val="single" w:color="BFBFBF" w:sz="4"/>
+            </w:tcBorders>
+            <w:shd w:fill="D5E8F0" w:val="clear"/>
+            <w:tcMar>
+              <w:top w:type="dxa" w:w="80"/>
+              <w:left w:type="dxa" w:w="120"/>
+              <w:bottom w:type="dxa" w:w="80"/>
+              <w:right w:type="dxa" w:w="120"/>
+            </w:tcMar>
+          </w:tcPr>
+          <w:p>
+            <w:pPr>
+              <w:spacing w:after="80"/>
+            </w:pPr>
+            <w:r>
+              <w:rPr>
+                <w:b/>
+                <w:bCs/>
+              </w:rPr>
+              <w:t xml:space="preserve">TaktOS / FreeRTOS</w:t>
+            </w:r>
+          </w:p>
+        </w:tc>
+        <w:tc>
+          <w:tcPr>
+            <w:tcW w:type="dxa" w:w="2120"/>
+            <w:tcBorders>
+              <w:top w:val="single" w:color="BFBFBF" w:sz="4"/>
+              <w:left w:val="single" w:color="BFBFBF" w:sz="4"/>
+              <w:bottom w:val="single" w:color="BFBFBF" w:sz="4"/>
+              <w:right w:val="single" w:color="BFBFBF" w:sz="4"/>
+            </w:tcBorders>
+            <w:shd w:fill="D5E8F0" w:val="clear"/>
+            <w:tcMar>
+              <w:top w:type="dxa" w:w="80"/>
+              <w:left w:type="dxa" w:w="120"/>
+              <w:bottom w:type="dxa" w:w="80"/>
+              <w:right w:type="dxa" w:w="120"/>
+            </w:tcMar>
+          </w:tcPr>
+          <w:p>
+            <w:pPr>
+              <w:spacing w:after="80"/>
+            </w:pPr>
+            <w:r>
+              <w:rPr>
+                <w:b/>
+                <w:bCs/>
+              </w:rPr>
+              <w:t xml:space="preserve">TaktOS / ThreadX</w:t>
+            </w:r>
+          </w:p>
+        </w:tc>
+        <w:tc>
+          <w:tcPr>
+            <w:tcW w:type="dxa" w:w="2120"/>
+            <w:tcBorders>
+              <w:top w:val="single" w:color="BFBFBF" w:sz="4"/>
+              <w:left w:val="single" w:color="BFBFBF" w:sz="4"/>
+              <w:bottom w:val="single" w:color="BFBFBF" w:sz="4"/>
+              <w:right w:val="single" w:color="BFBFBF" w:sz="4"/>
+            </w:tcBorders>
+            <w:shd w:fill="D5E8F0" w:val="clear"/>
+            <w:tcMar>
+              <w:top w:type="dxa" w:w="80"/>
+              <w:left w:type="dxa" w:w="120"/>
+              <w:bottom w:type="dxa" w:w="80"/>
+              <w:right w:type="dxa" w:w="120"/>
+            </w:tcMar>
+          </w:tcPr>
+          <w:p>
+            <w:pPr>
+              <w:spacing w:after="80"/>
+            </w:pPr>
+            <w:r>
+              <w:rPr>
+                <w:b/>
+                <w:bCs/>
+              </w:rPr>
+              <w:t xml:space="preserve">TaktOS / Zephyr</w:t>
+            </w:r>
+          </w:p>
+        </w:tc>
+      </w:tr>
+      <w:tr>
+        <w:tc>
+          <w:tcPr>
+            <w:tcW w:type="dxa" w:w="3000"/>
+            <w:tcBorders>
+              <w:top w:val="single" w:color="BFBFBF" w:sz="4"/>
+              <w:left w:val="single" w:color="BFBFBF" w:sz="4"/>
+              <w:bottom w:val="single" w:color="BFBFBF" w:sz="4"/>
+              <w:right w:val="single" w:color="BFBFBF" w:sz="4"/>
+            </w:tcBorders>
+            <w:tcMar>
+              <w:top w:type="dxa" w:w="70"/>
+              <w:left w:type="dxa" w:w="120"/>
+              <w:bottom w:type="dxa" w:w="70"/>
+              <w:right w:type="dxa" w:w="120"/>
+            </w:tcMar>
+          </w:tcPr>
+          <w:p>
+            <w:pPr>
+              <w:spacing w:after="80"/>
+            </w:pPr>
+            <w:r>
+              <w:t xml:space="preserve">SCHED_COOP_001</w:t>
+            </w:r>
+          </w:p>
+        </w:tc>
+        <w:tc>
+          <w:tcPr>
+            <w:tcW w:type="dxa" w:w="2120"/>
+            <w:tcBorders>
+              <w:top w:val="single" w:color="BFBFBF" w:sz="4"/>
+              <w:left w:val="single" w:color="BFBFBF" w:sz="4"/>
+              <w:bottom w:val="single" w:color="BFBFBF" w:sz="4"/>
+              <w:right w:val="single" w:color="BFBFBF" w:sz="4"/>
+            </w:tcBorders>
+            <w:tcMar>
+              <w:top w:type="dxa" w:w="70"/>
+              <w:left w:type="dxa" w:w="120"/>
+              <w:bottom w:type="dxa" w:w="70"/>
+              <w:right w:type="dxa" w:w="120"/>
+            </w:tcMar>
+          </w:tcPr>
+          <w:p>
+            <w:pPr>
+              <w:spacing w:after="80"/>
+            </w:pPr>
+            <w:r>
+              <w:t xml:space="preserve">+39%</w:t>
+            </w:r>
+          </w:p>
+        </w:tc>
+        <w:tc>
+          <w:tcPr>
+            <w:tcW w:type="dxa" w:w="2120"/>
+            <w:tcBorders>
+              <w:top w:val="single" w:color="BFBFBF" w:sz="4"/>
+              <w:left w:val="single" w:color="BFBFBF" w:sz="4"/>
+              <w:bottom w:val="single" w:color="BFBFBF" w:sz="4"/>
+              <w:right w:val="single" w:color="BFBFBF" w:sz="4"/>
+            </w:tcBorders>
+            <w:tcMar>
+              <w:top w:type="dxa" w:w="70"/>
+              <w:left w:type="dxa" w:w="120"/>
+              <w:bottom w:type="dxa" w:w="70"/>
+              <w:right w:type="dxa" w:w="120"/>
+            </w:tcMar>
+          </w:tcPr>
+          <w:p>
+            <w:pPr>
+              <w:spacing w:after="80"/>
+            </w:pPr>
+            <w:r>
+              <w:t xml:space="preserve">+110%</w:t>
+            </w:r>
+          </w:p>
+        </w:tc>
+        <w:tc>
+          <w:tcPr>
+            <w:tcW w:type="dxa" w:w="2120"/>
+            <w:tcBorders>
+              <w:top w:val="single" w:color="BFBFBF" w:sz="4"/>
+              <w:left w:val="single" w:color="BFBFBF" w:sz="4"/>
+              <w:bottom w:val="single" w:color="BFBFBF" w:sz="4"/>
+              <w:right w:val="single" w:color="BFBFBF" w:sz="4"/>
+            </w:tcBorders>
+            <w:tcMar>
+              <w:top w:type="dxa" w:w="70"/>
+              <w:left w:type="dxa" w:w="120"/>
+              <w:bottom w:type="dxa" w:w="70"/>
+              <w:right w:type="dxa" w:w="120"/>
+            </w:tcMar>
+          </w:tcPr>
+          <w:p>
+            <w:pPr>
+              <w:spacing w:after="80"/>
+            </w:pPr>
+            <w:r>
+              <w:t xml:space="preserve">—</w:t>
+            </w:r>
+          </w:p>
+        </w:tc>
+      </w:tr>
+      <w:tr>
+        <w:tc>
+          <w:tcPr>
+            <w:tcW w:type="dxa" w:w="3000"/>
+            <w:tcBorders>
+              <w:top w:val="single" w:color="BFBFBF" w:sz="4"/>
+              <w:left w:val="single" w:color="BFBFBF" w:sz="4"/>
+              <w:bottom w:val="single" w:color="BFBFBF" w:sz="4"/>
+              <w:right w:val="single" w:color="BFBFBF" w:sz="4"/>
+            </w:tcBorders>
+            <w:tcMar>
+              <w:top w:type="dxa" w:w="70"/>
+              <w:left w:type="dxa" w:w="120"/>
+              <w:bottom w:type="dxa" w:w="70"/>
+              <w:right w:type="dxa" w:w="120"/>
+            </w:tcMar>
+          </w:tcPr>
+          <w:p>
+            <w:pPr>
+              <w:spacing w:after="80"/>
+            </w:pPr>
+            <w:r>
+              <w:t xml:space="preserve">SYNC_SEM_FAST_001</w:t>
+            </w:r>
+          </w:p>
+        </w:tc>
+        <w:tc>
+          <w:tcPr>
+            <w:tcW w:type="dxa" w:w="2120"/>
+            <w:tcBorders>
+              <w:top w:val="single" w:color="BFBFBF" w:sz="4"/>
+              <w:left w:val="single" w:color="BFBFBF" w:sz="4"/>
+              <w:bottom w:val="single" w:color="BFBFBF" w:sz="4"/>
+              <w:right w:val="single" w:color="BFBFBF" w:sz="4"/>
+            </w:tcBorders>
+            <w:tcMar>
+              <w:top w:type="dxa" w:w="70"/>
+              <w:left w:type="dxa" w:w="120"/>
+              <w:bottom w:type="dxa" w:w="70"/>
+              <w:right w:type="dxa" w:w="120"/>
+            </w:tcMar>
+          </w:tcPr>
+          <w:p>
+            <w:pPr>
+              <w:spacing w:after="80"/>
+            </w:pPr>
+            <w:r>
+              <w:t xml:space="preserve">+125%</w:t>
+            </w:r>
+          </w:p>
+        </w:tc>
+        <w:tc>
+          <w:tcPr>
+            <w:tcW w:type="dxa" w:w="2120"/>
+            <w:tcBorders>
+              <w:top w:val="single" w:color="BFBFBF" w:sz="4"/>
+              <w:left w:val="single" w:color="BFBFBF" w:sz="4"/>
+              <w:bottom w:val="single" w:color="BFBFBF" w:sz="4"/>
+              <w:right w:val="single" w:color="BFBFBF" w:sz="4"/>
+            </w:tcBorders>
+            <w:tcMar>
+              <w:top w:type="dxa" w:w="70"/>
+              <w:left w:type="dxa" w:w="120"/>
+              <w:bottom w:type="dxa" w:w="70"/>
+              <w:right w:type="dxa" w:w="120"/>
+            </w:tcMar>
+          </w:tcPr>
+          <w:p>
+            <w:pPr>
+              <w:spacing w:after="80"/>
+            </w:pPr>
+            <w:r>
+              <w:t xml:space="preserve">+26%</w:t>
+            </w:r>
+          </w:p>
+        </w:tc>
+        <w:tc>
+          <w:tcPr>
+            <w:tcW w:type="dxa" w:w="2120"/>
+            <w:tcBorders>
+              <w:top w:val="single" w:color="BFBFBF" w:sz="4"/>
+              <w:left w:val="single" w:color="BFBFBF" w:sz="4"/>
+              <w:bottom w:val="single" w:color="BFBFBF" w:sz="4"/>
+              <w:right w:val="single" w:color="BFBFBF" w:sz="4"/>
+            </w:tcBorders>
+            <w:tcMar>
+              <w:top w:type="dxa" w:w="70"/>
+              <w:left w:type="dxa" w:w="120"/>
+              <w:bottom w:type="dxa" w:w="70"/>
+              <w:right w:type="dxa" w:w="120"/>
+            </w:tcMar>
+          </w:tcPr>
+          <w:p>
+            <w:pPr>
+              <w:spacing w:after="80"/>
+            </w:pPr>
+            <w:r>
+              <w:t xml:space="preserve">—</w:t>
+            </w:r>
+          </w:p>
+        </w:tc>
+      </w:tr>
+      <w:tr>
+        <w:tc>
+          <w:tcPr>
+            <w:tcW w:type="dxa" w:w="3000"/>
+            <w:tcBorders>
+              <w:top w:val="single" w:color="BFBFBF" w:sz="4"/>
+              <w:left w:val="single" w:color="BFBFBF" w:sz="4"/>
+              <w:bottom w:val="single" w:color="BFBFBF" w:sz="4"/>
+              <w:right w:val="single" w:color="BFBFBF" w:sz="4"/>
+            </w:tcBorders>
+            <w:tcMar>
+              <w:top w:type="dxa" w:w="70"/>
+              <w:left w:type="dxa" w:w="120"/>
+              <w:bottom w:type="dxa" w:w="70"/>
+              <w:right w:type="dxa" w:w="120"/>
+            </w:tcMar>
+          </w:tcPr>
+          <w:p>
+            <w:pPr>
+              <w:spacing w:after="80"/>
+            </w:pPr>
+            <w:r>
+              <w:t xml:space="preserve">SYNC_MUTEX_FAST_001</w:t>
+            </w:r>
+          </w:p>
+        </w:tc>
+        <w:tc>
+          <w:tcPr>
+            <w:tcW w:type="dxa" w:w="2120"/>
+            <w:tcBorders>
+              <w:top w:val="single" w:color="BFBFBF" w:sz="4"/>
+              <w:left w:val="single" w:color="BFBFBF" w:sz="4"/>
+              <w:bottom w:val="single" w:color="BFBFBF" w:sz="4"/>
+              <w:right w:val="single" w:color="BFBFBF" w:sz="4"/>
+            </w:tcBorders>
+            <w:tcMar>
+              <w:top w:type="dxa" w:w="70"/>
+              <w:left w:type="dxa" w:w="120"/>
+              <w:bottom w:type="dxa" w:w="70"/>
+              <w:right w:type="dxa" w:w="120"/>
+            </w:tcMar>
+          </w:tcPr>
+          <w:p>
+            <w:pPr>
+              <w:spacing w:after="80"/>
+            </w:pPr>
+            <w:r>
+              <w:t xml:space="preserve">+189%</w:t>
+            </w:r>
+          </w:p>
+        </w:tc>
+        <w:tc>
+          <w:tcPr>
+            <w:tcW w:type="dxa" w:w="2120"/>
+            <w:tcBorders>
+              <w:top w:val="single" w:color="BFBFBF" w:sz="4"/>
+              <w:left w:val="single" w:color="BFBFBF" w:sz="4"/>
+              <w:bottom w:val="single" w:color="BFBFBF" w:sz="4"/>
+              <w:right w:val="single" w:color="BFBFBF" w:sz="4"/>
+            </w:tcBorders>
+            <w:tcMar>
+              <w:top w:type="dxa" w:w="70"/>
+              <w:left w:type="dxa" w:w="120"/>
+              <w:bottom w:type="dxa" w:w="70"/>
+              <w:right w:type="dxa" w:w="120"/>
+            </w:tcMar>
+          </w:tcPr>
+          <w:p>
+            <w:pPr>
+              <w:spacing w:after="80"/>
+            </w:pPr>
+            <w:r>
+              <w:t xml:space="preserve">+147%</w:t>
+            </w:r>
+          </w:p>
+        </w:tc>
+        <w:tc>
+          <w:tcPr>
+            <w:tcW w:type="dxa" w:w="2120"/>
+            <w:tcBorders>
+              <w:top w:val="single" w:color="BFBFBF" w:sz="4"/>
+              <w:left w:val="single" w:color="BFBFBF" w:sz="4"/>
+              <w:bottom w:val="single" w:color="BFBFBF" w:sz="4"/>
+              <w:right w:val="single" w:color="BFBFBF" w:sz="4"/>
+            </w:tcBorders>
+            <w:tcMar>
+              <w:top w:type="dxa" w:w="70"/>
+              <w:left w:type="dxa" w:w="120"/>
+              <w:bottom w:type="dxa" w:w="70"/>
+              <w:right w:type="dxa" w:w="120"/>
+            </w:tcMar>
+          </w:tcPr>
+          <w:p>
+            <w:pPr>
+              <w:spacing w:after="80"/>
+            </w:pPr>
+            <w:r>
+              <w:t xml:space="preserve">—</w:t>
+            </w:r>
+          </w:p>
+        </w:tc>
+      </w:tr>
+      <w:tr>
+        <w:tc>
+          <w:tcPr>
+            <w:tcW w:type="dxa" w:w="3000"/>
+            <w:tcBorders>
+              <w:top w:val="single" w:color="BFBFBF" w:sz="4"/>
+              <w:left w:val="single" w:color="BFBFBF" w:sz="4"/>
+              <w:bottom w:val="single" w:color="BFBFBF" w:sz="4"/>
+              <w:right w:val="single" w:color="BFBFBF" w:sz="4"/>
+            </w:tcBorders>
+            <w:tcMar>
+              <w:top w:type="dxa" w:w="70"/>
+              <w:left w:type="dxa" w:w="120"/>
+              <w:bottom w:type="dxa" w:w="70"/>
+              <w:right w:type="dxa" w:w="120"/>
+            </w:tcMar>
+          </w:tcPr>
+          <w:p>
+            <w:pPr>
+              <w:spacing w:after="80"/>
+            </w:pPr>
+            <w:r>
+              <w:t xml:space="preserve">SYNC_MUTEX_PCP_FAST_001</w:t>
+            </w:r>
+          </w:p>
+        </w:tc>
+        <w:tc>
+          <w:tcPr>
+            <w:tcW w:type="dxa" w:w="2120"/>
+            <w:tcBorders>
+              <w:top w:val="single" w:color="BFBFBF" w:sz="4"/>
+              <w:left w:val="single" w:color="BFBFBF" w:sz="4"/>
+              <w:bottom w:val="single" w:color="BFBFBF" w:sz="4"/>
+              <w:right w:val="single" w:color="BFBFBF" w:sz="4"/>
+            </w:tcBorders>
+            <w:tcMar>
+              <w:top w:type="dxa" w:w="70"/>
+              <w:left w:type="dxa" w:w="120"/>
+              <w:bottom w:type="dxa" w:w="70"/>
+              <w:right w:type="dxa" w:w="120"/>
+            </w:tcMar>
+          </w:tcPr>
+          <w:p>
+            <w:pPr>
+              <w:spacing w:after="80"/>
+            </w:pPr>
+            <w:r>
+              <w:t xml:space="preserve">+43%</w:t>
+            </w:r>
+          </w:p>
+        </w:tc>
+        <w:tc>
+          <w:tcPr>
+            <w:tcW w:type="dxa" w:w="2120"/>
+            <w:tcBorders>
+              <w:top w:val="single" w:color="BFBFBF" w:sz="4"/>
+              <w:left w:val="single" w:color="BFBFBF" w:sz="4"/>
+              <w:bottom w:val="single" w:color="BFBFBF" w:sz="4"/>
+              <w:right w:val="single" w:color="BFBFBF" w:sz="4"/>
+            </w:tcBorders>
+            <w:tcMar>
+              <w:top w:type="dxa" w:w="70"/>
+              <w:left w:type="dxa" w:w="120"/>
+              <w:bottom w:type="dxa" w:w="70"/>
+              <w:right w:type="dxa" w:w="120"/>
+            </w:tcMar>
+          </w:tcPr>
+          <w:p>
+            <w:pPr>
+              <w:spacing w:after="80"/>
+            </w:pPr>
+            <w:r>
+              <w:t xml:space="preserve">+22%</w:t>
+            </w:r>
+          </w:p>
+        </w:tc>
+        <w:tc>
+          <w:tcPr>
+            <w:tcW w:type="dxa" w:w="2120"/>
+            <w:tcBorders>
+              <w:top w:val="single" w:color="BFBFBF" w:sz="4"/>
+              <w:left w:val="single" w:color="BFBFBF" w:sz="4"/>
+              <w:bottom w:val="single" w:color="BFBFBF" w:sz="4"/>
+              <w:right w:val="single" w:color="BFBFBF" w:sz="4"/>
+            </w:tcBorders>
+            <w:tcMar>
+              <w:top w:type="dxa" w:w="70"/>
+              <w:left w:type="dxa" w:w="120"/>
+              <w:bottom w:type="dxa" w:w="70"/>
+              <w:right w:type="dxa" w:w="120"/>
+            </w:tcMar>
+          </w:tcPr>
+          <w:p>
+            <w:pPr>
+              <w:spacing w:after="80"/>
+            </w:pPr>
+            <w:r>
+              <w:t xml:space="preserve">—</w:t>
+            </w:r>
+          </w:p>
+        </w:tc>
+      </w:tr>
+      <w:tr>
+        <w:tc>
+          <w:tcPr>
+            <w:tcW w:type="dxa" w:w="3000"/>
+            <w:tcBorders>
+              <w:top w:val="single" w:color="BFBFBF" w:sz="4"/>
+              <w:left w:val="single" w:color="BFBFBF" w:sz="4"/>
+              <w:bottom w:val="single" w:color="BFBFBF" w:sz="4"/>
+              <w:right w:val="single" w:color="BFBFBF" w:sz="4"/>
+            </w:tcBorders>
+            <w:tcMar>
+              <w:top w:type="dxa" w:w="70"/>
+              <w:left w:type="dxa" w:w="120"/>
+              <w:bottom w:type="dxa" w:w="70"/>
+              <w:right w:type="dxa" w:w="120"/>
+            </w:tcMar>
+          </w:tcPr>
+          <w:p>
+            <w:pPr>
+              <w:spacing w:after="80"/>
+            </w:pPr>
+            <w:r>
+              <w:t xml:space="preserve">IPC_QUEUE_FAST_001</w:t>
+            </w:r>
+          </w:p>
+        </w:tc>
+        <w:tc>
+          <w:tcPr>
+            <w:tcW w:type="dxa" w:w="2120"/>
+            <w:tcBorders>
+              <w:top w:val="single" w:color="BFBFBF" w:sz="4"/>
+              <w:left w:val="single" w:color="BFBFBF" w:sz="4"/>
+              <w:bottom w:val="single" w:color="BFBFBF" w:sz="4"/>
+              <w:right w:val="single" w:color="BFBFBF" w:sz="4"/>
+            </w:tcBorders>
+            <w:tcMar>
+              <w:top w:type="dxa" w:w="70"/>
+              <w:left w:type="dxa" w:w="120"/>
+              <w:bottom w:type="dxa" w:w="70"/>
+              <w:right w:type="dxa" w:w="120"/>
+            </w:tcMar>
+          </w:tcPr>
+          <w:p>
+            <w:pPr>
+              <w:spacing w:after="80"/>
+            </w:pPr>
+            <w:r>
+              <w:t xml:space="preserve">+102%</w:t>
+            </w:r>
+          </w:p>
+        </w:tc>
+        <w:tc>
+          <w:tcPr>
+            <w:tcW w:type="dxa" w:w="2120"/>
+            <w:tcBorders>
+              <w:top w:val="single" w:color="BFBFBF" w:sz="4"/>
+              <w:left w:val="single" w:color="BFBFBF" w:sz="4"/>
+              <w:bottom w:val="single" w:color="BFBFBF" w:sz="4"/>
+              <w:right w:val="single" w:color="BFBFBF" w:sz="4"/>
+            </w:tcBorders>
+            <w:tcMar>
+              <w:top w:type="dxa" w:w="70"/>
+              <w:left w:type="dxa" w:w="120"/>
+              <w:bottom w:type="dxa" w:w="70"/>
+              <w:right w:type="dxa" w:w="120"/>
+            </w:tcMar>
+          </w:tcPr>
+          <w:p>
+            <w:pPr>
+              <w:spacing w:after="80"/>
+            </w:pPr>
+            <w:r>
+              <w:t xml:space="preserve">+28%</w:t>
+            </w:r>
+          </w:p>
+        </w:tc>
+        <w:tc>
+          <w:tcPr>
+            <w:tcW w:type="dxa" w:w="2120"/>
+            <w:tcBorders>
+              <w:top w:val="single" w:color="BFBFBF" w:sz="4"/>
+              <w:left w:val="single" w:color="BFBFBF" w:sz="4"/>
+              <w:bottom w:val="single" w:color="BFBFBF" w:sz="4"/>
+              <w:right w:val="single" w:color="BFBFBF" w:sz="4"/>
+            </w:tcBorders>
+            <w:tcMar>
+              <w:top w:type="dxa" w:w="70"/>
+              <w:left w:type="dxa" w:w="120"/>
+              <w:bottom w:type="dxa" w:w="70"/>
+              <w:right w:type="dxa" w:w="120"/>
+            </w:tcMar>
+          </w:tcPr>
+          <w:p>
+            <w:pPr>
+              <w:spacing w:after="80"/>
+            </w:pPr>
+            <w:r>
+              <w:t xml:space="preserve">—</w:t>
+            </w:r>
+          </w:p>
+        </w:tc>
+      </w:tr>
+    </w:tbl>
+    <w:p>
+      <w:pPr>
+        <w:spacing w:after="80"/>
+      </w:pPr>
+      <w:r>
+        <w:t xml:space="preserve">TaktOS leads every throughput test on M0 against both FreeRTOS V11.3 and Eclipse ThreadX 6.x, with the widest gap on SYNC_MUTEX_FAST_001 (2.89× FreeRTOS, 2.47× ThreadX) and the narrowest on SCHED_COOP_001 (1.39× FreeRTOS — Cortex-M0 has no CLZ instruction, so TaktOS's bitmap SelectNext falls back to a software binary search that closes part of its usual lead). Zephyr is not run on this target — see §6.4. See §7.2 for the protocol distinction between SYNC_MUTEX_FAST_001 and SYNC_MUTEX_PCP_FAST_001.</w:t>
+      </w:r>
+    </w:p>
+    <w:p>
+      <w:pPr>
+        <w:pStyle w:val="Heading2"/>
+        <w:spacing w:after="100" w:before="220"/>
+      </w:pPr>
+      <w:r>
+        <w:rPr>
+          <w:rFonts w:ascii="Arial" w:cs="Arial" w:eastAsia="Arial" w:hAnsi="Arial"/>
+          <w:b/>
+          <w:bCs/>
+          <w:color w:val="1F3864"/>
+          <w:sz w:val="26"/>
+          <w:szCs w:val="26"/>
+        </w:rPr>
+        <w:t xml:space="preserve">6.3  Binary size</w:t>
+      </w:r>
+    </w:p>
+    <w:tbl>
+      <w:tblPr>
+        <w:tblW w:type="dxa" w:w="9360"/>
+        <w:tblBorders>
+          <w:top w:val="single" w:color="auto" w:sz="4"/>
+          <w:left w:val="single" w:color="auto" w:sz="4"/>
+          <w:bottom w:val="single" w:color="auto" w:sz="4"/>
+          <w:right w:val="single" w:color="auto" w:sz="4"/>
+          <w:insideH w:val="single" w:color="auto" w:sz="4"/>
+          <w:insideV w:val="single" w:color="auto" w:sz="4"/>
+        </w:tblBorders>
+      </w:tblPr>
+      <w:tblGrid>
+        <w:gridCol w:w="3200"/>
+        <w:gridCol w:w="3200"/>
+        <w:gridCol w:w="2960"/>
+      </w:tblGrid>
+      <w:tr>
+        <w:trPr>
+          <w:tblHeader/>
+        </w:trPr>
+        <w:tc>
+          <w:tcPr>
+            <w:tcW w:type="dxa" w:w="3200"/>
+            <w:tcBorders>
+              <w:top w:val="single" w:color="BFBFBF" w:sz="4"/>
+              <w:left w:val="single" w:color="BFBFBF" w:sz="4"/>
+              <w:bottom w:val="single" w:color="BFBFBF" w:sz="4"/>
+              <w:right w:val="single" w:color="BFBFBF" w:sz="4"/>
+            </w:tcBorders>
+            <w:shd w:fill="D5E8F0" w:val="clear"/>
+            <w:tcMar>
+              <w:top w:type="dxa" w:w="80"/>
+              <w:left w:type="dxa" w:w="120"/>
+              <w:bottom w:type="dxa" w:w="80"/>
+              <w:right w:type="dxa" w:w="120"/>
+            </w:tcMar>
+          </w:tcPr>
+          <w:p>
+            <w:pPr>
+              <w:spacing w:after="80"/>
+            </w:pPr>
+            <w:r>
+              <w:rPr>
+                <w:b/>
+                <w:bCs/>
+              </w:rPr>
+              <w:t xml:space="preserve">Kernel</w:t>
+            </w:r>
+          </w:p>
+        </w:tc>
+        <w:tc>
+          <w:tcPr>
+            <w:tcW w:type="dxa" w:w="3200"/>
+            <w:tcBorders>
+              <w:top w:val="single" w:color="BFBFBF" w:sz="4"/>
+              <w:left w:val="single" w:color="BFBFBF" w:sz="4"/>
+              <w:bottom w:val="single" w:color="BFBFBF" w:sz="4"/>
+              <w:right w:val="single" w:color="BFBFBF" w:sz="4"/>
+            </w:tcBorders>
+            <w:shd w:fill="D5E8F0" w:val="clear"/>
+            <w:tcMar>
+              <w:top w:type="dxa" w:w="80"/>
+              <w:left w:type="dxa" w:w="120"/>
+              <w:bottom w:type="dxa" w:w="80"/>
+              <w:right w:type="dxa" w:w="120"/>
+            </w:tcMar>
+          </w:tcPr>
+          <w:p>
+            <w:pPr>
+              <w:spacing w:after="80"/>
+            </w:pPr>
+            <w:r>
+              <w:rPr>
+                <w:b/>
+                <w:bCs/>
+              </w:rPr>
+              <w:t xml:space="preserve">.text bytes</w:t>
+            </w:r>
+          </w:p>
+        </w:tc>
+        <w:tc>
+          <w:tcPr>
+            <w:tcW w:type="dxa" w:w="2960"/>
+            <w:tcBorders>
+              <w:top w:val="single" w:color="BFBFBF" w:sz="4"/>
+              <w:left w:val="single" w:color="BFBFBF" w:sz="4"/>
+              <w:bottom w:val="single" w:color="BFBFBF" w:sz="4"/>
+              <w:right w:val="single" w:color="BFBFBF" w:sz="4"/>
+            </w:tcBorders>
+            <w:shd w:fill="D5E8F0" w:val="clear"/>
+            <w:tcMar>
+              <w:top w:type="dxa" w:w="80"/>
+              <w:left w:type="dxa" w:w="120"/>
+              <w:bottom w:type="dxa" w:w="80"/>
+              <w:right w:type="dxa" w:w="120"/>
+            </w:tcMar>
+          </w:tcPr>
+          <w:p>
+            <w:pPr>
+              <w:spacing w:after="80"/>
+            </w:pPr>
+            <w:r>
+              <w:rPr>
+                <w:b/>
+                <w:bCs/>
+              </w:rPr>
+              <w:t xml:space="preserve">vs TaktOS</w:t>
+            </w:r>
+          </w:p>
+        </w:tc>
+      </w:tr>
+      <w:tr>
+        <w:tc>
+          <w:tcPr>
+            <w:tcW w:type="dxa" w:w="3200"/>
+            <w:tcBorders>
+              <w:top w:val="single" w:color="BFBFBF" w:sz="4"/>
+              <w:left w:val="single" w:color="BFBFBF" w:sz="4"/>
+              <w:bottom w:val="single" w:color="BFBFBF" w:sz="4"/>
+              <w:right w:val="single" w:color="BFBFBF" w:sz="4"/>
+            </w:tcBorders>
+            <w:tcMar>
+              <w:top w:type="dxa" w:w="70"/>
+              <w:left w:type="dxa" w:w="120"/>
+              <w:bottom w:type="dxa" w:w="70"/>
+              <w:right w:type="dxa" w:w="120"/>
+            </w:tcMar>
+          </w:tcPr>
+          <w:p>
+            <w:pPr>
+              <w:spacing w:after="80"/>
+            </w:pPr>
+            <w:r>
+              <w:t xml:space="preserve">TaktOS</w:t>
+            </w:r>
+          </w:p>
+        </w:tc>
+        <w:tc>
+          <w:tcPr>
+            <w:tcW w:type="dxa" w:w="3200"/>
+            <w:tcBorders>
+              <w:top w:val="single" w:color="BFBFBF" w:sz="4"/>
+              <w:left w:val="single" w:color="BFBFBF" w:sz="4"/>
+              <w:bottom w:val="single" w:color="BFBFBF" w:sz="4"/>
+              <w:right w:val="single" w:color="BFBFBF" w:sz="4"/>
+            </w:tcBorders>
+            <w:tcMar>
+              <w:top w:type="dxa" w:w="70"/>
+              <w:left w:type="dxa" w:w="120"/>
+              <w:bottom w:type="dxa" w:w="70"/>
+              <w:right w:type="dxa" w:w="120"/>
+            </w:tcMar>
+          </w:tcPr>
+          <w:p>
+            <w:pPr>
+              <w:spacing w:after="80"/>
+            </w:pPr>
+            <w:r>
+              <w:t xml:space="preserve">31,784</w:t>
+            </w:r>
+          </w:p>
+        </w:tc>
+        <w:tc>
+          <w:tcPr>
+            <w:tcW w:type="dxa" w:w="2960"/>
+            <w:tcBorders>
+              <w:top w:val="single" w:color="BFBFBF" w:sz="4"/>
+              <w:left w:val="single" w:color="BFBFBF" w:sz="4"/>
+              <w:bottom w:val="single" w:color="BFBFBF" w:sz="4"/>
+              <w:right w:val="single" w:color="BFBFBF" w:sz="4"/>
+            </w:tcBorders>
+            <w:tcMar>
+              <w:top w:type="dxa" w:w="70"/>
+              <w:left w:type="dxa" w:w="120"/>
+              <w:bottom w:type="dxa" w:w="70"/>
+              <w:right w:type="dxa" w:w="120"/>
+            </w:tcMar>
+          </w:tcPr>
+          <w:p>
+            <w:pPr>
+              <w:spacing w:after="80"/>
+            </w:pPr>
+            <w:r>
+              <w:t xml:space="preserve">—</w:t>
+            </w:r>
+          </w:p>
+        </w:tc>
+      </w:tr>
+      <w:tr>
+        <w:tc>
+          <w:tcPr>
+            <w:tcW w:type="dxa" w:w="3200"/>
+            <w:tcBorders>
+              <w:top w:val="single" w:color="BFBFBF" w:sz="4"/>
+              <w:left w:val="single" w:color="BFBFBF" w:sz="4"/>
+              <w:bottom w:val="single" w:color="BFBFBF" w:sz="4"/>
+              <w:right w:val="single" w:color="BFBFBF" w:sz="4"/>
+            </w:tcBorders>
+            <w:tcMar>
+              <w:top w:type="dxa" w:w="70"/>
+              <w:left w:type="dxa" w:w="120"/>
+              <w:bottom w:type="dxa" w:w="70"/>
+              <w:right w:type="dxa" w:w="120"/>
+            </w:tcMar>
+          </w:tcPr>
+          <w:p>
+            <w:pPr>
+              <w:spacing w:after="80"/>
+            </w:pPr>
+            <w:r>
+              <w:t xml:space="preserve">FreeRTOS</w:t>
+            </w:r>
+          </w:p>
+        </w:tc>
+        <w:tc>
+          <w:tcPr>
+            <w:tcW w:type="dxa" w:w="3200"/>
+            <w:tcBorders>
+              <w:top w:val="single" w:color="BFBFBF" w:sz="4"/>
+              <w:left w:val="single" w:color="BFBFBF" w:sz="4"/>
+              <w:bottom w:val="single" w:color="BFBFBF" w:sz="4"/>
+              <w:right w:val="single" w:color="BFBFBF" w:sz="4"/>
+            </w:tcBorders>
+            <w:tcMar>
+              <w:top w:type="dxa" w:w="70"/>
+              <w:left w:type="dxa" w:w="120"/>
+              <w:bottom w:type="dxa" w:w="70"/>
+              <w:right w:type="dxa" w:w="120"/>
+            </w:tcMar>
+          </w:tcPr>
+          <w:p>
+            <w:pPr>
+              <w:spacing w:after="80"/>
+            </w:pPr>
+            <w:r>
+              <w:t xml:space="preserve">32,208</w:t>
+            </w:r>
+          </w:p>
+        </w:tc>
+        <w:tc>
+          <w:tcPr>
+            <w:tcW w:type="dxa" w:w="2960"/>
+            <w:tcBorders>
+              <w:top w:val="single" w:color="BFBFBF" w:sz="4"/>
+              <w:left w:val="single" w:color="BFBFBF" w:sz="4"/>
+              <w:bottom w:val="single" w:color="BFBFBF" w:sz="4"/>
+              <w:right w:val="single" w:color="BFBFBF" w:sz="4"/>
+            </w:tcBorders>
+            <w:tcMar>
+              <w:top w:type="dxa" w:w="70"/>
+              <w:left w:type="dxa" w:w="120"/>
+              <w:bottom w:type="dxa" w:w="70"/>
+              <w:right w:type="dxa" w:w="120"/>
+            </w:tcMar>
+          </w:tcPr>
+          <w:p>
+            <w:pPr>
+              <w:spacing w:after="80"/>
+            </w:pPr>
+            <w:r>
+              <w:t xml:space="preserve">+1.3%</w:t>
+            </w:r>
+          </w:p>
+        </w:tc>
+      </w:tr>
+      <w:tr>
+        <w:tc>
+          <w:tcPr>
+            <w:tcW w:type="dxa" w:w="3200"/>
+            <w:tcBorders>
+              <w:top w:val="single" w:color="BFBFBF" w:sz="4"/>
+              <w:left w:val="single" w:color="BFBFBF" w:sz="4"/>
+              <w:bottom w:val="single" w:color="BFBFBF" w:sz="4"/>
+              <w:right w:val="single" w:color="BFBFBF" w:sz="4"/>
+            </w:tcBorders>
+            <w:tcMar>
+              <w:top w:type="dxa" w:w="70"/>
+              <w:left w:type="dxa" w:w="120"/>
+              <w:bottom w:type="dxa" w:w="70"/>
+              <w:right w:type="dxa" w:w="120"/>
+            </w:tcMar>
+          </w:tcPr>
+          <w:p>
+            <w:pPr>
+              <w:spacing w:after="80"/>
+            </w:pPr>
+            <w:r>
+              <w:t xml:space="preserve">ThreadX</w:t>
+            </w:r>
+          </w:p>
+        </w:tc>
+        <w:tc>
+          <w:tcPr>
+            <w:tcW w:type="dxa" w:w="3200"/>
+            <w:tcBorders>
+              <w:top w:val="single" w:color="BFBFBF" w:sz="4"/>
+              <w:left w:val="single" w:color="BFBFBF" w:sz="4"/>
+              <w:bottom w:val="single" w:color="BFBFBF" w:sz="4"/>
+              <w:right w:val="single" w:color="BFBFBF" w:sz="4"/>
+            </w:tcBorders>
+            <w:tcMar>
+              <w:top w:type="dxa" w:w="70"/>
+              <w:left w:type="dxa" w:w="120"/>
+              <w:bottom w:type="dxa" w:w="70"/>
+              <w:right w:type="dxa" w:w="120"/>
+            </w:tcMar>
+          </w:tcPr>
+          <w:p>
+            <w:pPr>
+              <w:spacing w:after="80"/>
+            </w:pPr>
+            <w:r>
+              <w:t xml:space="preserve">35,764</w:t>
+            </w:r>
+          </w:p>
+        </w:tc>
+        <w:tc>
+          <w:tcPr>
+            <w:tcW w:type="dxa" w:w="2960"/>
+            <w:tcBorders>
+              <w:top w:val="single" w:color="BFBFBF" w:sz="4"/>
+              <w:left w:val="single" w:color="BFBFBF" w:sz="4"/>
+              <w:bottom w:val="single" w:color="BFBFBF" w:sz="4"/>
+              <w:right w:val="single" w:color="BFBFBF" w:sz="4"/>
+            </w:tcBorders>
+            <w:tcMar>
+              <w:top w:type="dxa" w:w="70"/>
+              <w:left w:type="dxa" w:w="120"/>
+              <w:bottom w:type="dxa" w:w="70"/>
+              <w:right w:type="dxa" w:w="120"/>
+            </w:tcMar>
+          </w:tcPr>
+          <w:p>
+            <w:pPr>
+              <w:spacing w:after="80"/>
+            </w:pPr>
+            <w:r>
+              <w:t xml:space="preserve">+12.5%</w:t>
+            </w:r>
+          </w:p>
+        </w:tc>
+      </w:tr>
+      <w:tr>
+        <w:tc>
+          <w:tcPr>
+            <w:tcW w:type="dxa" w:w="3200"/>
+            <w:tcBorders>
+              <w:top w:val="single" w:color="BFBFBF" w:sz="4"/>
+              <w:left w:val="single" w:color="BFBFBF" w:sz="4"/>
+              <w:bottom w:val="single" w:color="BFBFBF" w:sz="4"/>
+              <w:right w:val="single" w:color="BFBFBF" w:sz="4"/>
+            </w:tcBorders>
+            <w:tcMar>
+              <w:top w:type="dxa" w:w="70"/>
+              <w:left w:type="dxa" w:w="120"/>
+              <w:bottom w:type="dxa" w:w="70"/>
+              <w:right w:type="dxa" w:w="120"/>
+            </w:tcMar>
+          </w:tcPr>
+          <w:p>
+            <w:pPr>
+              <w:spacing w:after="80"/>
+            </w:pPr>
+            <w:r>
+              <w:t xml:space="preserve">Zephyr</w:t>
+            </w:r>
+          </w:p>
+        </w:tc>
+        <w:tc>
+          <w:tcPr>
+            <w:tcW w:type="dxa" w:w="3200"/>
+            <w:tcBorders>
+              <w:top w:val="single" w:color="BFBFBF" w:sz="4"/>
+              <w:left w:val="single" w:color="BFBFBF" w:sz="4"/>
+              <w:bottom w:val="single" w:color="BFBFBF" w:sz="4"/>
+              <w:right w:val="single" w:color="BFBFBF" w:sz="4"/>
+            </w:tcBorders>
+            <w:tcMar>
+              <w:top w:type="dxa" w:w="70"/>
+              <w:left w:type="dxa" w:w="120"/>
+              <w:bottom w:type="dxa" w:w="70"/>
+              <w:right w:type="dxa" w:w="120"/>
+            </w:tcMar>
+          </w:tcPr>
+          <w:p>
+            <w:pPr>
+              <w:spacing w:after="80"/>
+            </w:pPr>
+            <w:r>
+              <w:t xml:space="preserve">n/a</w:t>
+            </w:r>
+          </w:p>
+        </w:tc>
+        <w:tc>
+          <w:tcPr>
+            <w:tcW w:type="dxa" w:w="2960"/>
+            <w:tcBorders>
+              <w:top w:val="single" w:color="BFBFBF" w:sz="4"/>
+              <w:left w:val="single" w:color="BFBFBF" w:sz="4"/>
+              <w:bottom w:val="single" w:color="BFBFBF" w:sz="4"/>
+              <w:right w:val="single" w:color="BFBFBF" w:sz="4"/>
+            </w:tcBorders>
+            <w:tcMar>
+              <w:top w:type="dxa" w:w="70"/>
+              <w:left w:type="dxa" w:w="120"/>
+              <w:bottom w:type="dxa" w:w="70"/>
+              <w:right w:type="dxa" w:w="120"/>
+            </w:tcMar>
+          </w:tcPr>
+          <w:p>
+            <w:pPr>
+              <w:spacing w:after="80"/>
+            </w:pPr>
+            <w:r>
+              <w:t xml:space="preserve">—</w:t>
+            </w:r>
+          </w:p>
+        </w:tc>
+      </w:tr>
+    </w:tbl>
+    <w:p>
+      <w:pPr>
+        <w:pStyle w:val="Heading2"/>
+        <w:spacing w:after="100" w:before="220"/>
+      </w:pPr>
+      <w:r>
+        <w:rPr>
+          <w:rFonts w:ascii="Arial" w:cs="Arial" w:eastAsia="Arial" w:hAnsi="Arial"/>
+          <w:b/>
+          <w:bCs/>
+          <w:color w:val="1F3864"/>
+          <w:sz w:val="26"/>
+          <w:szCs w:val="26"/>
+        </w:rPr>
+        <w:t xml:space="preserve">6.4  Platform notes</w:t>
+      </w:r>
+    </w:p>
+    <w:p>
+      <w:pPr>
+        <w:spacing w:after="120"/>
+      </w:pPr>
+      <w:r>
+        <w:rPr>
+          <w:rFonts w:ascii="Arial" w:cs="Arial" w:eastAsia="Arial" w:hAnsi="Arial"/>
+          <w:sz w:val="22"/>
+          <w:szCs w:val="22"/>
+        </w:rPr>
+        <w:t xml:space="preserve">STM32F0308-DISCO is the most architecturally constrained KVB target in the suite. ARMv6-M has no DWT cycle counter, no CLZ instruction, and no LDREX/STREX exclusive-monitor pair. CLZ is supplied by a software binary-search fallback (~12 cycles); critical sections substitute for atomic primitives on the no-waiter path. TaktOS still leads every throughput test, with the largest gaps on operations where the kernel does the most work per call: SCHED_COOP (CLZ-bitmap SelectNext vs linked-list ready walk) and SYNC_MUTEX (single-word IPCP path vs queue-substrate Give in FreeRTOS / parameter-validated Put in ThreadX).</w:t>
+      </w:r>
+    </w:p>
+    <w:p>
+      <w:pPr>
+        <w:spacing w:after="120"/>
+      </w:pPr>
+      <w:r>
+        <w:rPr>
+          <w:rFonts w:ascii="Arial" w:cs="Arial" w:eastAsia="Arial" w:hAnsi="Arial"/>
+          <w:sz w:val="22"/>
+          <w:szCs w:val="22"/>
+        </w:rPr>
+        <w:t xml:space="preserve">TaktOS exposes two mutex APIs on M0, matching the M33 / M4F structure: a plain mutex (no priority protocol — measured by SYNC_MUTEX_FAST_001 at 216,834 p/s) and an IPCP variant (Immediate Priority Ceiling Protocol — measured by SYNC_MUTEX_PCP_FAST_001 at 108,334 p/s). The IPCP path raises the holder's effective priority to the lock's ceiling on every Lock, tracks the held-ceiling stack, and restores on Unlock — about 5 µs of additional bookkeeping per pair on M0. The split lets safety/cert customers pick the bounded-priority-inversion guarantee where they need it, and pay the lighter cost on hot paths where IPCP isn't required.</w:t>
+      </w:r>
+    </w:p>
+    <w:p>
+      <w:pPr>
+        <w:spacing w:after="120"/>
+      </w:pPr>
+      <w:r>
+        <w:rPr>
+          <w:rFonts w:ascii="Arial" w:cs="Arial" w:eastAsia="Arial" w:hAnsi="Arial"/>
+          <w:sz w:val="22"/>
+          <w:szCs w:val="22"/>
+        </w:rPr>
+        <w:t xml:space="preserve">FreeRTOS on STM32F0308 uses a 4 KB heap_4 arena alongside configSUPPORT_STATIC_ALLOCATION=1. The V11.3 ARM_CM0 split port hardfaults inside PendSV at first context switch on this IOsonata startup environment when configured pure-static; the heap is the working configuration on this target only. Allocations occur during test setup, outside measured loops, so steady-state throughput is not affected. Disclosed; not subtracted out.</w:t>
+      </w:r>
+    </w:p>
+    <w:p>
+      <w:pPr>
+        <w:spacing w:after="120"/>
+      </w:pPr>
+      <w:r>
+        <w:rPr>
+          <w:rFonts w:ascii="Arial" w:cs="Arial" w:eastAsia="Arial" w:hAnsi="Arial"/>
+          <w:sz w:val="22"/>
+          <w:szCs w:val="22"/>
+        </w:rPr>
+        <w:t xml:space="preserve">TIME_SLEEP_001 splits the three kernels into two design camps. TaktOS guarantees actual ≥ requested by adding +1u at every timed-wait site — the 10476 µs result is the long-bias cost of that guarantee. FreeRTOS and ThreadX schedule wakeup at current_tick + N regardless of where in the current period the call lands; FreeRTOS happens to enter the call within ~5 µs of a tick edge on this firmware (10005 µs, +0.05 % from target — tick-edge perfect), and ThreadX enters mid-period (9537 µs, −463 µs short). All three PASS the KVB 90 % floor; only TaktOS satisfies the strict at-least-N-ticks bound deterministically. FreeRTOS satisfies it on this run by 5 µs — depends on tick alignment, not guaranteed by design.</w:t>
+      </w:r>
+    </w:p>
+    <w:p>
+      <w:pPr>
+        <w:spacing w:after="120"/>
+      </w:pPr>
+      <w:r>
+        <w:rPr>
+          <w:rFonts w:ascii="Arial" w:cs="Arial" w:eastAsia="Arial" w:hAnsi="Arial"/>
+          <w:sz w:val="22"/>
+          <w:szCs w:val="22"/>
+        </w:rPr>
+        <w:t xml:space="preserve">Zephyr is not run on STM32F0308 in this revision. Zephyr's STM32F030R8 board support exists but does not run at the same parity bar (CONFIG_HEAP_MEM_POOL_SIZE=0, MPU off, validation regimes matched) used for the M33 and M4 KVB ports without additional porting work. Adding a parity Zephyr build for this target is open work tracked in §11. The 3-way comparison reported here is final for Rev 3.4.</w:t>
+      </w:r>
+    </w:p>
+    <w:p>
+      <w:pPr>
+        <w:pStyle w:val="Heading1"/>
+        <w:spacing w:after="140" w:before="280"/>
+      </w:pPr>
+      <w:r>
+        <w:rPr>
+          <w:rFonts w:ascii="Arial" w:cs="Arial" w:eastAsia="Arial" w:hAnsi="Arial"/>
+          <w:b/>
+          <w:bCs/>
+          <w:color w:val="1F3864"/>
+          <w:sz w:val="32"/>
+          <w:szCs w:val="32"/>
+        </w:rPr>
+        <w:t xml:space="preserve">7.  Behavioural Tests</w:t>
+      </w:r>
+    </w:p>
+    <w:p>
+      <w:pPr>
+        <w:pStyle w:val="Heading2"/>
+        <w:spacing w:after="100" w:before="220"/>
+      </w:pPr>
+      <w:r>
+        <w:rPr>
+          <w:rFonts w:ascii="Arial" w:cs="Arial" w:eastAsia="Arial" w:hAnsi="Arial"/>
+          <w:b/>
+          <w:bCs/>
+          <w:color w:val="1F3864"/>
+          <w:sz w:val="26"/>
+          <w:szCs w:val="26"/>
+        </w:rPr>
+        <w:t xml:space="preserve">7.1  Mutex ownership rejection</w:t>
       </w:r>
     </w:p>
     <w:p>
@@ -13459,7 +16593,7 @@
           <w:sz w:val="26"/>
           <w:szCs w:val="26"/>
         </w:rPr>
-        <w:t xml:space="preserve">6.2  Mutex protocol distinction — PCP vs PI</w:t>
+        <w:t xml:space="preserve">7.2  Mutex protocol distinction — PCP vs PI</w:t>
       </w:r>
     </w:p>
     <w:p>
@@ -13518,7 +16652,7 @@
           <w:sz w:val="26"/>
           <w:szCs w:val="26"/>
         </w:rPr>
-        <w:t xml:space="preserve">6.3  Sleep duration accuracy</w:t>
+        <w:t xml:space="preserve">7.3  Sleep duration accuracy</w:t>
       </w:r>
     </w:p>
     <w:p>
@@ -13569,7 +16703,7 @@
           <w:sz w:val="32"/>
           <w:szCs w:val="32"/>
         </w:rPr>
-        <w:t xml:space="preserve">7.  TAKT_INLINE_OPTIMIZATION — Effect</w:t>
+        <w:t xml:space="preserve">8.  TAKT_INLINE_OPTIMIZATION — Effect</w:t>
       </w:r>
     </w:p>
     <w:p>
@@ -13602,7 +16736,7 @@
           <w:sz w:val="32"/>
           <w:szCs w:val="32"/>
         </w:rPr>
-        <w:t xml:space="preserve">8.  Validation Status</w:t>
+        <w:t xml:space="preserve">9.  Validation Status</w:t>
       </w:r>
     </w:p>
     <w:p>
@@ -13679,7 +16813,7 @@
           <w:sz w:val="32"/>
           <w:szCs w:val="32"/>
         </w:rPr>
-        <w:t xml:space="preserve">9.  Certification Boundary</w:t>
+        <w:t xml:space="preserve">10.  Certification Boundary</w:t>
       </w:r>
     </w:p>
     <w:p>
@@ -15126,7 +18260,7 @@
           <w:sz w:val="32"/>
           <w:szCs w:val="32"/>
         </w:rPr>
-        <w:t xml:space="preserve">10.  Open Items</w:t>
+        <w:t xml:space="preserve">11.  Open Items</w:t>
       </w:r>
     </w:p>
     <w:tbl>
@@ -15930,6 +19064,83 @@
             </w:pPr>
             <w:r>
               <w:t xml:space="preserve">CLOSED. TIME_SLEEP_001 PASSes on both boards for TaktOS, with elapsed_us ≥ 10000 µs (the strict at-least-N-ticks bound).</w:t>
+            </w:r>
+          </w:p>
+        </w:tc>
+      </w:tr>
+      <w:tr>
+        <w:tc>
+          <w:tcPr>
+            <w:tcW w:type="dxa" w:w="600"/>
+            <w:tcBorders>
+              <w:top w:val="single" w:color="BFBFBF" w:sz="4"/>
+              <w:left w:val="single" w:color="BFBFBF" w:sz="4"/>
+              <w:bottom w:val="single" w:color="BFBFBF" w:sz="4"/>
+              <w:right w:val="single" w:color="BFBFBF" w:sz="4"/>
+            </w:tcBorders>
+            <w:tcMar>
+              <w:top w:type="dxa" w:w="70"/>
+              <w:left w:type="dxa" w:w="120"/>
+              <w:bottom w:type="dxa" w:w="70"/>
+              <w:right w:type="dxa" w:w="120"/>
+            </w:tcMar>
+          </w:tcPr>
+          <w:p>
+            <w:pPr>
+              <w:spacing w:after="80"/>
+            </w:pPr>
+            <w:r>
+              <w:t xml:space="preserve">10</w:t>
+            </w:r>
+          </w:p>
+        </w:tc>
+        <w:tc>
+          <w:tcPr>
+            <w:tcW w:type="dxa" w:w="3500"/>
+            <w:tcBorders>
+              <w:top w:val="single" w:color="BFBFBF" w:sz="4"/>
+              <w:left w:val="single" w:color="BFBFBF" w:sz="4"/>
+              <w:bottom w:val="single" w:color="BFBFBF" w:sz="4"/>
+              <w:right w:val="single" w:color="BFBFBF" w:sz="4"/>
+            </w:tcBorders>
+            <w:tcMar>
+              <w:top w:type="dxa" w:w="70"/>
+              <w:left w:type="dxa" w:w="120"/>
+              <w:bottom w:type="dxa" w:w="70"/>
+              <w:right w:type="dxa" w:w="120"/>
+            </w:tcMar>
+          </w:tcPr>
+          <w:p>
+            <w:pPr>
+              <w:spacing w:after="80"/>
+            </w:pPr>
+            <w:r>
+              <w:t xml:space="preserve">Zephyr STM32F0308 port at KVB parity.</w:t>
+            </w:r>
+          </w:p>
+        </w:tc>
+        <w:tc>
+          <w:tcPr>
+            <w:tcW w:type="dxa" w:w="5260"/>
+            <w:tcBorders>
+              <w:top w:val="single" w:color="BFBFBF" w:sz="4"/>
+              <w:left w:val="single" w:color="BFBFBF" w:sz="4"/>
+              <w:bottom w:val="single" w:color="BFBFBF" w:sz="4"/>
+              <w:right w:val="single" w:color="BFBFBF" w:sz="4"/>
+            </w:tcBorders>
+            <w:tcMar>
+              <w:top w:type="dxa" w:w="70"/>
+              <w:left w:type="dxa" w:w="120"/>
+              <w:bottom w:type="dxa" w:w="70"/>
+              <w:right w:type="dxa" w:w="120"/>
+            </w:tcMar>
+          </w:tcPr>
+          <w:p>
+            <w:pPr>
+              <w:spacing w:after="80"/>
+            </w:pPr>
+            <w:r>
+              <w:t xml:space="preserve">OPEN. STM32F030R8 board support exists in Zephyr but does not run at the parity bar (CONFIG_HEAP_MEM_POOL_SIZE=0, MPU off, validation regimes matched) used for the M33 and M4 KVB ports without additional porting work. Required to extend §6 from 3-way to 4-way.</w:t>
             </w:r>
           </w:p>
         </w:tc>
@@ -20061,7 +23272,7 @@
           <w:sz w:val="32"/>
           <w:szCs w:val="32"/>
         </w:rPr>
-        <w:t xml:space="preserve">11.  References</w:t>
+        <w:t xml:space="preserve">12.  References</w:t>
       </w:r>
     </w:p>
     <w:p>
@@ -20088,6 +23299,19 @@
       </w:pPr>
       <w:r>
         <w:t xml:space="preserve">KVB / Targets / nRF52832 / nRF52832_KVB_Comparison.md — strict-parity 5-run aggregate canonical comparison for nRF52832 (Document version 2.2, 2026-05-01, Zephyr 4.2.99).</w:t>
+      </w:r>
+    </w:p>
+    <w:p>
+      <w:pPr>
+        <w:pStyle w:val="ListParagraph"/>
+        <w:numPr>
+          <w:ilvl w:val="0"/>
+          <w:numId w:val="2"/>
+        </w:numPr>
+        <w:spacing w:after="60"/>
+      </w:pPr>
+      <w:r>
+        <w:t xml:space="preserve">KVB / Targets / STM32F0308 / STM32F0308_KVB_Comparison.md — strict-parity 5-run aggregate canonical comparison for STM32F0308-DISCO (Document version 4.0, 2026-04-29, three-way TaktOS / FreeRTOS V11.3 / ThreadX 6.x).</w:t>
       </w:r>
     </w:p>
     <w:p>

</xml_diff>